<commit_message>
Stop numbering unused CVP 15.1 identity tables as Table 15
Seed-matching incomplete shells no longer consume Table N, so Capacity/MOC
rows with empty Details do not caption as Table 15. Relabel the collapsed
equipment-sampling section 15.1–15.10 so 15.11 nitrosamine is not a skip,
and upgrade leftover Cvp * caption titles.

Co-authored-by: sachin.agrawal272 <sachin.agrawal272@gmail.com>
</commit_message>
<xml_diff>
--- a/templates/3xper-cleaning-verification-protocol-template.docx
+++ b/templates/3xper-cleaning-verification-protocol-template.docx
@@ -799,7 +799,7 @@
                 <w:sz w:val="24"/>
                 <w:szCs w:val="24"/>
               </w:rPr>
-              <w:t xml:space="preserve">15.1 Equipment Sampling Plans</w:t>
+              <w:t xml:space="preserve">15.1–15.10 Equipment Sampling Plans</w:t>
             </w:r>
           </w:p>
         </w:tc>
@@ -1404,7 +1404,7 @@
           <w:sz w:val="24"/>
           <w:szCs w:val="24"/>
         </w:rPr>
-        <w:t xml:space="preserve">15.1 Equipment Sampling Plans</w:t>
+        <w:t xml:space="preserve">15.1–15.10 Equipment Sampling Plans</w:t>
       </w:r>
     </w:p>
     <w:p>

</xml_diff>

<commit_message>
Drop the lumped 15.1–15.10 Word wrapper so CVP export prints nested 15.N headings.
The rebuilt template lets 15.N.M headings come from the section body, and the editor toolbar no longer reads documentType before a report is loaded.
</commit_message>
<xml_diff>
--- a/templates/3xper-cleaning-verification-protocol-template.docx
+++ b/templates/3xper-cleaning-verification-protocol-template.docx
@@ -799,25 +799,6 @@
                 <w:sz w:val="24"/>
                 <w:szCs w:val="24"/>
               </w:rPr>
-              <w:t xml:space="preserve">15.1–15.10 Equipment Sampling Plans</w:t>
-            </w:r>
-          </w:p>
-        </w:tc>
-      </w:tr>
-      <w:tr>
-        <w:tc>
-          <w:tcPr>
-            <w:tcW w:w="10000" w:type="dxa"/>
-          </w:tcPr>
-          <w:p>
-            <w:pPr>
-              <w:spacing w:before="40" w:after="40"/>
-            </w:pPr>
-            <w:r>
-              <w:rPr>
-                <w:sz w:val="24"/>
-                <w:szCs w:val="24"/>
-              </w:rPr>
               <w:t xml:space="preserve">15.11 Nitrosamine Limits in the Rinse Samples</w:t>
             </w:r>
           </w:p>
@@ -838,63 +819,6 @@
                 <w:szCs w:val="24"/>
               </w:rPr>
               <w:t xml:space="preserve">15.12 Potential Genotoxic Impurities Limits in the Rinse Samples</w:t>
-            </w:r>
-          </w:p>
-        </w:tc>
-      </w:tr>
-      <w:tr>
-        <w:tc>
-          <w:tcPr>
-            <w:tcW w:w="10000" w:type="dxa"/>
-          </w:tcPr>
-          <w:p>
-            <w:pPr>
-              <w:spacing w:before="40" w:after="40"/>
-            </w:pPr>
-            <w:r>
-              <w:rPr>
-                <w:sz w:val="24"/>
-                <w:szCs w:val="24"/>
-              </w:rPr>
-              <w:t xml:space="preserve">Process Line Cleaning Verification Summary</w:t>
-            </w:r>
-          </w:p>
-        </w:tc>
-      </w:tr>
-      <w:tr>
-        <w:tc>
-          <w:tcPr>
-            <w:tcW w:w="10000" w:type="dxa"/>
-          </w:tcPr>
-          <w:p>
-            <w:pPr>
-              <w:spacing w:before="40" w:after="40"/>
-            </w:pPr>
-            <w:r>
-              <w:rPr>
-                <w:sz w:val="24"/>
-                <w:szCs w:val="24"/>
-              </w:rPr>
-              <w:t xml:space="preserve">Manufacturing Area Cleaning Verification</w:t>
-            </w:r>
-          </w:p>
-        </w:tc>
-      </w:tr>
-      <w:tr>
-        <w:tc>
-          <w:tcPr>
-            <w:tcW w:w="10000" w:type="dxa"/>
-          </w:tcPr>
-          <w:p>
-            <w:pPr>
-              <w:spacing w:before="40" w:after="40"/>
-            </w:pPr>
-            <w:r>
-              <w:rPr>
-                <w:sz w:val="24"/>
-                <w:szCs w:val="24"/>
-              </w:rPr>
-              <w:t xml:space="preserve">Overall Cleaning Results Summary</w:t>
             </w:r>
           </w:p>
         </w:tc>
@@ -1389,22 +1313,6 @@
     <w:p>
       <w:r>
         <w:t>{@cvp_sampling_planXml}</w:t>
-      </w:r>
-    </w:p>
-    <w:p>
-      <w:pPr>
-        <w:pStyle w:val="Heading1"/>
-        <w:keepNext/>
-        <w:spacing w:before="200" w:after="80" w:line="360" w:lineRule="auto"/>
-        <w:jc w:val="both"/>
-      </w:pPr>
-      <w:r>
-        <w:rPr>
-          <w:b/>
-          <w:sz w:val="24"/>
-          <w:szCs w:val="24"/>
-        </w:rPr>
-        <w:t xml:space="preserve">15.1–15.10 Equipment Sampling Plans</w:t>
       </w:r>
     </w:p>
     <w:p>

</xml_diff>

<commit_message>
Give CVP equipment its own duplicable boxes and stop seed text from coming back.
Clearing a TipTap field restored the instructional template on merge, and heading replacements could not land on a lumped 15.1–15.10 narrative.
</commit_message>
<xml_diff>
--- a/templates/3xper-cleaning-verification-protocol-template.docx
+++ b/templates/3xper-cleaning-verification-protocol-template.docx
@@ -799,7 +799,7 @@
                 <w:sz w:val="24"/>
                 <w:szCs w:val="24"/>
               </w:rPr>
-              <w:t xml:space="preserve">15.11 Nitrosamine Limits in the Rinse Samples</w:t>
+              <w:t xml:space="preserve">Nitrosamine Limits in the Rinse Samples</w:t>
             </w:r>
           </w:p>
         </w:tc>
@@ -818,7 +818,7 @@
                 <w:sz w:val="24"/>
                 <w:szCs w:val="24"/>
               </w:rPr>
-              <w:t xml:space="preserve">15.12 Potential Genotoxic Impurities Limits in the Rinse Samples</w:t>
+              <w:t xml:space="preserve">Potential Genotoxic Impurities Limits in the Rinse Samples</w:t>
             </w:r>
           </w:p>
         </w:tc>
@@ -1333,7 +1333,7 @@
           <w:sz w:val="24"/>
           <w:szCs w:val="24"/>
         </w:rPr>
-        <w:t xml:space="preserve">15.11 Nitrosamine Limits in the Rinse Samples</w:t>
+        <w:t xml:space="preserve">Nitrosamine Limits in the Rinse Samples</w:t>
       </w:r>
     </w:p>
     <w:p>
@@ -1354,7 +1354,7 @@
           <w:sz w:val="24"/>
           <w:szCs w:val="24"/>
         </w:rPr>
-        <w:t xml:space="preserve">15.12 Potential Genotoxic Impurities Limits in the Rinse Samples</w:t>
+        <w:t xml:space="preserve">Potential Genotoxic Impurities Limits in the Rinse Samples</w:t>
       </w:r>
     </w:p>
     <w:p>

</xml_diff>

<commit_message>
Align cleaning-protocol Word export with the source paper form.
Replace the static TOC and baked 1.0 headings with Word numbering, and
fix spacing, list styles, merged cells, and leftover citation digits.
</commit_message>
<xml_diff>
--- a/templates/3xper-cleaning-verification-protocol-template.docx
+++ b/templates/3xper-cleaning-verification-protocol-template.docx
@@ -469,11 +469,64 @@
         <w:br w:type="page"/>
       </w:r>
     </w:p>
+    <w:sdt>
+      <w:sdtPr>
+        <w:docPartObj>
+          <w:docPartGallery w:val="Table of Contents"/>
+          <w:docPartUnique/>
+        </w:docPartObj>
+      </w:sdtPr>
+      <w:sdtContent>
+        <w:p>
+          <w:pPr>
+            <w:pStyle w:val="TOCHeading"/>
+            <w:outlineLvl w:val="9"/>
+            <w:ind w:left="0" w:firstLine="0"/>
+            <w:spacing w:before="23" w:line="360" w:lineRule="auto"/>
+          </w:pPr>
+          <w:r>
+            <w:rPr>
+              <w:b/>
+              <w:color w:val="000000"/>
+              <w:sz w:val="24"/>
+              <w:szCs w:val="24"/>
+            </w:rPr>
+            <w:t xml:space="preserve">TABLE OF CONTENTS</w:t>
+          </w:r>
+        </w:p>
+        <w:p>
+          <w:r>
+            <w:fldChar w:fldCharType="begin"/>
+          </w:r>
+          <w:r>
+            <w:instrText xml:space="preserve"> TOC \o "1-1" \h \z \u </w:instrText>
+          </w:r>
+          <w:r>
+            <w:fldChar w:fldCharType="separate"/>
+          </w:r>
+          <w:r>
+            <w:t xml:space="preserve">Right-click and choose Update Field to refresh this table of contents.</w:t>
+          </w:r>
+          <w:r>
+            <w:fldChar w:fldCharType="end"/>
+          </w:r>
+        </w:p>
+      </w:sdtContent>
+    </w:sdt>
+    <w:p>
+      <w:r>
+        <w:br w:type="page"/>
+      </w:r>
+    </w:p>
     <w:p>
       <w:pPr>
         <w:pStyle w:val="Heading1"/>
         <w:keepNext/>
-        <w:spacing w:before="200" w:after="80" w:line="360" w:lineRule="auto"/>
+        <w:numPr>
+          <w:ilvl w:val="0"/>
+          <w:numId w:val="3"/>
+        </w:numPr>
+        <w:spacing w:before="23" w:line="360" w:lineRule="auto"/>
         <w:jc w:val="both"/>
       </w:pPr>
       <w:r>
@@ -482,529 +535,23 @@
           <w:sz w:val="24"/>
           <w:szCs w:val="24"/>
         </w:rPr>
-        <w:t xml:space="preserve">TABLE OF CONTENTS</w:t>
-      </w:r>
-    </w:p>
-    <w:tbl>
-      <w:tblPr>
-        <w:tblW w:w="10000" w:type="dxa"/>
-        <w:tblBorders>
-          <w:top w:val="nil"/>
-          <w:left w:val="nil"/>
-          <w:bottom w:val="nil"/>
-          <w:right w:val="nil"/>
-          <w:insideH w:val="nil"/>
-          <w:insideV w:val="nil"/>
-        </w:tblBorders>
-      </w:tblPr>
-      <w:tblGrid>
-        <w:gridCol w:w="10000"/>
-      </w:tblGrid>
-      <w:tr>
-        <w:tc>
-          <w:tcPr>
-            <w:tcW w:w="10000" w:type="dxa"/>
-          </w:tcPr>
-          <w:p>
-            <w:pPr>
-              <w:spacing w:before="40" w:after="40"/>
-            </w:pPr>
-            <w:r>
-              <w:rPr>
-                <w:sz w:val="24"/>
-                <w:szCs w:val="24"/>
-              </w:rPr>
-              <w:t xml:space="preserve">1.0 Approval Signatures</w:t>
-            </w:r>
-          </w:p>
-        </w:tc>
-      </w:tr>
-      <w:tr>
-        <w:tc>
-          <w:tcPr>
-            <w:tcW w:w="10000" w:type="dxa"/>
-          </w:tcPr>
-          <w:p>
-            <w:pPr>
-              <w:spacing w:before="40" w:after="40"/>
-            </w:pPr>
-            <w:r>
-              <w:rPr>
-                <w:sz w:val="24"/>
-                <w:szCs w:val="24"/>
-              </w:rPr>
-              <w:t xml:space="preserve">2.0 Objective</w:t>
-            </w:r>
-          </w:p>
-        </w:tc>
-      </w:tr>
-      <w:tr>
-        <w:tc>
-          <w:tcPr>
-            <w:tcW w:w="10000" w:type="dxa"/>
-          </w:tcPr>
-          <w:p>
-            <w:pPr>
-              <w:spacing w:before="40" w:after="40"/>
-            </w:pPr>
-            <w:r>
-              <w:rPr>
-                <w:sz w:val="24"/>
-                <w:szCs w:val="24"/>
-              </w:rPr>
-              <w:t xml:space="preserve">3.0 Scope</w:t>
-            </w:r>
-          </w:p>
-        </w:tc>
-      </w:tr>
-      <w:tr>
-        <w:tc>
-          <w:tcPr>
-            <w:tcW w:w="10000" w:type="dxa"/>
-          </w:tcPr>
-          <w:p>
-            <w:pPr>
-              <w:spacing w:before="40" w:after="40"/>
-            </w:pPr>
-            <w:r>
-              <w:rPr>
-                <w:sz w:val="24"/>
-                <w:szCs w:val="24"/>
-              </w:rPr>
-              <w:t xml:space="preserve">4.0 Responsibilities</w:t>
-            </w:r>
-          </w:p>
-        </w:tc>
-      </w:tr>
-      <w:tr>
-        <w:tc>
-          <w:tcPr>
-            <w:tcW w:w="10000" w:type="dxa"/>
-          </w:tcPr>
-          <w:p>
-            <w:pPr>
-              <w:spacing w:before="40" w:after="40"/>
-            </w:pPr>
-            <w:r>
-              <w:rPr>
-                <w:sz w:val="24"/>
-                <w:szCs w:val="24"/>
-              </w:rPr>
-              <w:t xml:space="preserve">5.0 Background and Cleaning Procedure</w:t>
-            </w:r>
-          </w:p>
-        </w:tc>
-      </w:tr>
-      <w:tr>
-        <w:tc>
-          <w:tcPr>
-            <w:tcW w:w="10000" w:type="dxa"/>
-          </w:tcPr>
-          <w:p>
-            <w:pPr>
-              <w:spacing w:before="40" w:after="40"/>
-            </w:pPr>
-            <w:r>
-              <w:rPr>
-                <w:sz w:val="24"/>
-                <w:szCs w:val="24"/>
-              </w:rPr>
-              <w:t xml:space="preserve">6.0 Pre-requisites</w:t>
-            </w:r>
-          </w:p>
-        </w:tc>
-      </w:tr>
-      <w:tr>
-        <w:tc>
-          <w:tcPr>
-            <w:tcW w:w="10000" w:type="dxa"/>
-          </w:tcPr>
-          <w:p>
-            <w:pPr>
-              <w:spacing w:before="40" w:after="40"/>
-            </w:pPr>
-            <w:r>
-              <w:rPr>
-                <w:sz w:val="24"/>
-                <w:szCs w:val="24"/>
-              </w:rPr>
-              <w:t xml:space="preserve">7.0 Equipment Qualification Status</w:t>
-            </w:r>
-          </w:p>
-        </w:tc>
-      </w:tr>
-      <w:tr>
-        <w:tc>
-          <w:tcPr>
-            <w:tcW w:w="10000" w:type="dxa"/>
-          </w:tcPr>
-          <w:p>
-            <w:pPr>
-              <w:spacing w:before="40" w:after="40"/>
-            </w:pPr>
-            <w:r>
-              <w:rPr>
-                <w:sz w:val="24"/>
-                <w:szCs w:val="24"/>
-              </w:rPr>
-              <w:t xml:space="preserve">8.0 Surface Area of the Equipment</w:t>
-            </w:r>
-          </w:p>
-        </w:tc>
-      </w:tr>
-      <w:tr>
-        <w:tc>
-          <w:tcPr>
-            <w:tcW w:w="10000" w:type="dxa"/>
-          </w:tcPr>
-          <w:p>
-            <w:pPr>
-              <w:spacing w:before="40" w:after="40"/>
-            </w:pPr>
-            <w:r>
-              <w:rPr>
-                <w:sz w:val="24"/>
-                <w:szCs w:val="24"/>
-              </w:rPr>
-              <w:t xml:space="preserve">9.0 Rinse Volume Calculation</w:t>
-            </w:r>
-          </w:p>
-        </w:tc>
-      </w:tr>
-      <w:tr>
-        <w:tc>
-          <w:tcPr>
-            <w:tcW w:w="10000" w:type="dxa"/>
-          </w:tcPr>
-          <w:p>
-            <w:pPr>
-              <w:spacing w:before="40" w:after="40"/>
-            </w:pPr>
-            <w:r>
-              <w:rPr>
-                <w:sz w:val="24"/>
-                <w:szCs w:val="24"/>
-              </w:rPr>
-              <w:t xml:space="preserve">10.0 Maximum Allowable Carryover (MACO)</w:t>
-            </w:r>
-          </w:p>
-        </w:tc>
-      </w:tr>
-      <w:tr>
-        <w:tc>
-          <w:tcPr>
-            <w:tcW w:w="10000" w:type="dxa"/>
-          </w:tcPr>
-          <w:p>
-            <w:pPr>
-              <w:spacing w:before="40" w:after="40"/>
-            </w:pPr>
-            <w:r>
-              <w:rPr>
-                <w:sz w:val="24"/>
-                <w:szCs w:val="24"/>
-              </w:rPr>
-              <w:t xml:space="preserve">11.0 Acceptance Limit Calculation (Swab and Rinse)</w:t>
-            </w:r>
-          </w:p>
-        </w:tc>
-      </w:tr>
-      <w:tr>
-        <w:tc>
-          <w:tcPr>
-            <w:tcW w:w="10000" w:type="dxa"/>
-          </w:tcPr>
-          <w:p>
-            <w:pPr>
-              <w:spacing w:before="40" w:after="40"/>
-            </w:pPr>
-            <w:r>
-              <w:rPr>
-                <w:sz w:val="24"/>
-                <w:szCs w:val="24"/>
-              </w:rPr>
-              <w:t xml:space="preserve">12.0 Cleaning Verification Methodology</w:t>
-            </w:r>
-          </w:p>
-        </w:tc>
-      </w:tr>
-      <w:tr>
-        <w:tc>
-          <w:tcPr>
-            <w:tcW w:w="10000" w:type="dxa"/>
-          </w:tcPr>
-          <w:p>
-            <w:pPr>
-              <w:spacing w:before="40" w:after="40"/>
-            </w:pPr>
-            <w:r>
-              <w:rPr>
-                <w:sz w:val="24"/>
-                <w:szCs w:val="24"/>
-              </w:rPr>
-              <w:t xml:space="preserve">13.0 Sampling Procedure</w:t>
-            </w:r>
-          </w:p>
-        </w:tc>
-      </w:tr>
-      <w:tr>
-        <w:tc>
-          <w:tcPr>
-            <w:tcW w:w="10000" w:type="dxa"/>
-          </w:tcPr>
-          <w:p>
-            <w:pPr>
-              <w:spacing w:before="40" w:after="40"/>
-            </w:pPr>
-            <w:r>
-              <w:rPr>
-                <w:sz w:val="24"/>
-                <w:szCs w:val="24"/>
-              </w:rPr>
-              <w:t xml:space="preserve">14.0 Determination of Swab Sample Locations</w:t>
-            </w:r>
-          </w:p>
-        </w:tc>
-      </w:tr>
-      <w:tr>
-        <w:tc>
-          <w:tcPr>
-            <w:tcW w:w="10000" w:type="dxa"/>
-          </w:tcPr>
-          <w:p>
-            <w:pPr>
-              <w:spacing w:before="40" w:after="40"/>
-            </w:pPr>
-            <w:r>
-              <w:rPr>
-                <w:sz w:val="24"/>
-                <w:szCs w:val="24"/>
-              </w:rPr>
-              <w:t xml:space="preserve">15.0 Sampling Plan, Acceptance Criteria and Cleaning Validation Results Summary</w:t>
-            </w:r>
-          </w:p>
-        </w:tc>
-      </w:tr>
-      <w:tr>
-        <w:tc>
-          <w:tcPr>
-            <w:tcW w:w="10000" w:type="dxa"/>
-          </w:tcPr>
-          <w:p>
-            <w:pPr>
-              <w:spacing w:before="40" w:after="40"/>
-            </w:pPr>
-            <w:r>
-              <w:rPr>
-                <w:sz w:val="24"/>
-                <w:szCs w:val="24"/>
-              </w:rPr>
-              <w:t xml:space="preserve">Nitrosamine Limits in the Rinse Samples</w:t>
-            </w:r>
-          </w:p>
-        </w:tc>
-      </w:tr>
-      <w:tr>
-        <w:tc>
-          <w:tcPr>
-            <w:tcW w:w="10000" w:type="dxa"/>
-          </w:tcPr>
-          <w:p>
-            <w:pPr>
-              <w:spacing w:before="40" w:after="40"/>
-            </w:pPr>
-            <w:r>
-              <w:rPr>
-                <w:sz w:val="24"/>
-                <w:szCs w:val="24"/>
-              </w:rPr>
-              <w:t xml:space="preserve">Potential Genotoxic Impurities Limits in the Rinse Samples</w:t>
-            </w:r>
-          </w:p>
-        </w:tc>
-      </w:tr>
-      <w:tr>
-        <w:tc>
-          <w:tcPr>
-            <w:tcW w:w="10000" w:type="dxa"/>
-          </w:tcPr>
-          <w:p>
-            <w:pPr>
-              <w:spacing w:before="40" w:after="40"/>
-            </w:pPr>
-            <w:r>
-              <w:rPr>
-                <w:sz w:val="24"/>
-                <w:szCs w:val="24"/>
-              </w:rPr>
-              <w:t xml:space="preserve">16.0 Testing Procedure</w:t>
-            </w:r>
-          </w:p>
-        </w:tc>
-      </w:tr>
-      <w:tr>
-        <w:tc>
-          <w:tcPr>
-            <w:tcW w:w="10000" w:type="dxa"/>
-          </w:tcPr>
-          <w:p>
-            <w:pPr>
-              <w:spacing w:before="40" w:after="40"/>
-            </w:pPr>
-            <w:r>
-              <w:rPr>
-                <w:sz w:val="24"/>
-                <w:szCs w:val="24"/>
-              </w:rPr>
-              <w:t xml:space="preserve">17.0 Status of Cleaning Analytical Method Validation</w:t>
-            </w:r>
-          </w:p>
-        </w:tc>
-      </w:tr>
-      <w:tr>
-        <w:tc>
-          <w:tcPr>
-            <w:tcW w:w="10000" w:type="dxa"/>
-          </w:tcPr>
-          <w:p>
-            <w:pPr>
-              <w:spacing w:before="40" w:after="40"/>
-            </w:pPr>
-            <w:r>
-              <w:rPr>
-                <w:sz w:val="24"/>
-                <w:szCs w:val="24"/>
-              </w:rPr>
-              <w:t xml:space="preserve">18.0 Evaluation of Results and Reporting</w:t>
-            </w:r>
-          </w:p>
-        </w:tc>
-      </w:tr>
-      <w:tr>
-        <w:tc>
-          <w:tcPr>
-            <w:tcW w:w="10000" w:type="dxa"/>
-          </w:tcPr>
-          <w:p>
-            <w:pPr>
-              <w:spacing w:before="40" w:after="40"/>
-            </w:pPr>
-            <w:r>
-              <w:rPr>
-                <w:sz w:val="24"/>
-                <w:szCs w:val="24"/>
-              </w:rPr>
-              <w:t xml:space="preserve">19.0 Deviations</w:t>
-            </w:r>
-          </w:p>
-        </w:tc>
-      </w:tr>
-      <w:tr>
-        <w:tc>
-          <w:tcPr>
-            <w:tcW w:w="10000" w:type="dxa"/>
-          </w:tcPr>
-          <w:p>
-            <w:pPr>
-              <w:spacing w:before="40" w:after="40"/>
-            </w:pPr>
-            <w:r>
-              <w:rPr>
-                <w:sz w:val="24"/>
-                <w:szCs w:val="24"/>
-              </w:rPr>
-              <w:t xml:space="preserve">20.0 Revalidation</w:t>
-            </w:r>
-          </w:p>
-        </w:tc>
-      </w:tr>
-      <w:tr>
-        <w:tc>
-          <w:tcPr>
-            <w:tcW w:w="10000" w:type="dxa"/>
-          </w:tcPr>
-          <w:p>
-            <w:pPr>
-              <w:spacing w:before="40" w:after="40"/>
-            </w:pPr>
-            <w:r>
-              <w:rPr>
-                <w:sz w:val="24"/>
-                <w:szCs w:val="24"/>
-              </w:rPr>
-              <w:t xml:space="preserve">21.0 Abbreviations</w:t>
-            </w:r>
-          </w:p>
-        </w:tc>
-      </w:tr>
-      <w:tr>
-        <w:tc>
-          <w:tcPr>
-            <w:tcW w:w="10000" w:type="dxa"/>
-          </w:tcPr>
-          <w:p>
-            <w:pPr>
-              <w:spacing w:before="40" w:after="40"/>
-            </w:pPr>
-            <w:r>
-              <w:rPr>
-                <w:sz w:val="24"/>
-                <w:szCs w:val="24"/>
-              </w:rPr>
-              <w:t xml:space="preserve">22.0 Related Documents</w:t>
-            </w:r>
-          </w:p>
-        </w:tc>
-      </w:tr>
-      <w:tr>
-        <w:tc>
-          <w:tcPr>
-            <w:tcW w:w="10000" w:type="dxa"/>
-          </w:tcPr>
-          <w:p>
-            <w:pPr>
-              <w:spacing w:before="40" w:after="40"/>
-            </w:pPr>
-            <w:r>
-              <w:rPr>
-                <w:sz w:val="24"/>
-                <w:szCs w:val="24"/>
-              </w:rPr>
-              <w:t xml:space="preserve">23.0 List of Annexures</w:t>
-            </w:r>
-          </w:p>
-        </w:tc>
-      </w:tr>
-      <w:tr>
-        <w:tc>
-          <w:tcPr>
-            <w:tcW w:w="10000" w:type="dxa"/>
-          </w:tcPr>
-          <w:p>
-            <w:pPr>
-              <w:spacing w:before="40" w:after="40"/>
-            </w:pPr>
-            <w:r>
-              <w:rPr>
-                <w:sz w:val="24"/>
-                <w:szCs w:val="24"/>
-              </w:rPr>
-              <w:t xml:space="preserve">24.0 History of the Document</w:t>
-            </w:r>
-          </w:p>
-        </w:tc>
-      </w:tr>
-    </w:tbl>
-    <w:p>
-      <w:r>
-        <w:br w:type="page"/>
+        <w:t xml:space="preserve">APPROVAL SIGNATURES</w:t>
+      </w:r>
+    </w:p>
+    <w:p>
+      <w:r>
+        <w:t>{@cvp_approvalsXml}</w:t>
       </w:r>
     </w:p>
     <w:p>
       <w:pPr>
         <w:pStyle w:val="Heading1"/>
         <w:keepNext/>
-        <w:spacing w:before="200" w:after="80" w:line="360" w:lineRule="auto"/>
+        <w:numPr>
+          <w:ilvl w:val="0"/>
+          <w:numId w:val="3"/>
+        </w:numPr>
+        <w:spacing w:before="23" w:line="360" w:lineRule="auto"/>
         <w:jc w:val="both"/>
       </w:pPr>
       <w:r>
@@ -1013,19 +560,23 @@
           <w:sz w:val="24"/>
           <w:szCs w:val="24"/>
         </w:rPr>
-        <w:t xml:space="preserve">1.0 Approval Signatures</w:t>
-      </w:r>
-    </w:p>
-    <w:p>
-      <w:r>
-        <w:t>{@cvp_approvalsXml}</w:t>
+        <w:t xml:space="preserve">OBJECTIVE</w:t>
+      </w:r>
+    </w:p>
+    <w:p>
+      <w:r>
+        <w:t>{@cvp_objectiveXml}</w:t>
       </w:r>
     </w:p>
     <w:p>
       <w:pPr>
         <w:pStyle w:val="Heading1"/>
         <w:keepNext/>
-        <w:spacing w:before="200" w:after="80" w:line="360" w:lineRule="auto"/>
+        <w:numPr>
+          <w:ilvl w:val="0"/>
+          <w:numId w:val="3"/>
+        </w:numPr>
+        <w:spacing w:before="23" w:line="360" w:lineRule="auto"/>
         <w:jc w:val="both"/>
       </w:pPr>
       <w:r>
@@ -1034,19 +585,23 @@
           <w:sz w:val="24"/>
           <w:szCs w:val="24"/>
         </w:rPr>
-        <w:t xml:space="preserve">2.0 Objective</w:t>
-      </w:r>
-    </w:p>
-    <w:p>
-      <w:r>
-        <w:t>{@cvp_objectiveXml}</w:t>
+        <w:t xml:space="preserve">SCOPE</w:t>
+      </w:r>
+    </w:p>
+    <w:p>
+      <w:r>
+        <w:t>{@cvp_scopeXml}</w:t>
       </w:r>
     </w:p>
     <w:p>
       <w:pPr>
         <w:pStyle w:val="Heading1"/>
         <w:keepNext/>
-        <w:spacing w:before="200" w:after="80" w:line="360" w:lineRule="auto"/>
+        <w:numPr>
+          <w:ilvl w:val="0"/>
+          <w:numId w:val="3"/>
+        </w:numPr>
+        <w:spacing w:before="23" w:line="360" w:lineRule="auto"/>
         <w:jc w:val="both"/>
       </w:pPr>
       <w:r>
@@ -1055,19 +610,23 @@
           <w:sz w:val="24"/>
           <w:szCs w:val="24"/>
         </w:rPr>
-        <w:t xml:space="preserve">3.0 Scope</w:t>
-      </w:r>
-    </w:p>
-    <w:p>
-      <w:r>
-        <w:t>{@cvp_scopeXml}</w:t>
+        <w:t xml:space="preserve">RESPONSIBILITIES</w:t>
+      </w:r>
+    </w:p>
+    <w:p>
+      <w:r>
+        <w:t>{@cvp_responsibilitiesXml}</w:t>
       </w:r>
     </w:p>
     <w:p>
       <w:pPr>
         <w:pStyle w:val="Heading1"/>
         <w:keepNext/>
-        <w:spacing w:before="200" w:after="80" w:line="360" w:lineRule="auto"/>
+        <w:numPr>
+          <w:ilvl w:val="0"/>
+          <w:numId w:val="3"/>
+        </w:numPr>
+        <w:spacing w:before="23" w:line="360" w:lineRule="auto"/>
         <w:jc w:val="both"/>
       </w:pPr>
       <w:r>
@@ -1076,19 +635,23 @@
           <w:sz w:val="24"/>
           <w:szCs w:val="24"/>
         </w:rPr>
-        <w:t xml:space="preserve">4.0 Responsibilities</w:t>
-      </w:r>
-    </w:p>
-    <w:p>
-      <w:r>
-        <w:t>{@cvp_responsibilitiesXml}</w:t>
+        <w:t xml:space="preserve">BACKGROUND AND CLEANING PROCEDURE</w:t>
+      </w:r>
+    </w:p>
+    <w:p>
+      <w:r>
+        <w:t>{@cvp_backgroundXml}</w:t>
       </w:r>
     </w:p>
     <w:p>
       <w:pPr>
         <w:pStyle w:val="Heading1"/>
         <w:keepNext/>
-        <w:spacing w:before="200" w:after="80" w:line="360" w:lineRule="auto"/>
+        <w:numPr>
+          <w:ilvl w:val="0"/>
+          <w:numId w:val="3"/>
+        </w:numPr>
+        <w:spacing w:before="23" w:line="360" w:lineRule="auto"/>
         <w:jc w:val="both"/>
       </w:pPr>
       <w:r>
@@ -1097,19 +660,23 @@
           <w:sz w:val="24"/>
           <w:szCs w:val="24"/>
         </w:rPr>
-        <w:t xml:space="preserve">5.0 Background and Cleaning Procedure</w:t>
-      </w:r>
-    </w:p>
-    <w:p>
-      <w:r>
-        <w:t>{@cvp_backgroundXml}</w:t>
+        <w:t xml:space="preserve">PRE-REQUISITES</w:t>
+      </w:r>
+    </w:p>
+    <w:p>
+      <w:r>
+        <w:t>{@cvp_prerequisitesXml}</w:t>
       </w:r>
     </w:p>
     <w:p>
       <w:pPr>
         <w:pStyle w:val="Heading1"/>
         <w:keepNext/>
-        <w:spacing w:before="200" w:after="80" w:line="360" w:lineRule="auto"/>
+        <w:numPr>
+          <w:ilvl w:val="0"/>
+          <w:numId w:val="3"/>
+        </w:numPr>
+        <w:spacing w:before="23" w:line="360" w:lineRule="auto"/>
         <w:jc w:val="both"/>
       </w:pPr>
       <w:r>
@@ -1118,19 +685,23 @@
           <w:sz w:val="24"/>
           <w:szCs w:val="24"/>
         </w:rPr>
-        <w:t xml:space="preserve">6.0 Pre-requisites</w:t>
-      </w:r>
-    </w:p>
-    <w:p>
-      <w:r>
-        <w:t>{@cvp_prerequisitesXml}</w:t>
+        <w:t xml:space="preserve">EQUIPMENT QUALIFICATION STATUS</w:t>
+      </w:r>
+    </w:p>
+    <w:p>
+      <w:r>
+        <w:t>{@cvp_qualification_statusXml}</w:t>
       </w:r>
     </w:p>
     <w:p>
       <w:pPr>
         <w:pStyle w:val="Heading1"/>
         <w:keepNext/>
-        <w:spacing w:before="200" w:after="80" w:line="360" w:lineRule="auto"/>
+        <w:numPr>
+          <w:ilvl w:val="0"/>
+          <w:numId w:val="3"/>
+        </w:numPr>
+        <w:spacing w:before="23" w:line="360" w:lineRule="auto"/>
         <w:jc w:val="both"/>
       </w:pPr>
       <w:r>
@@ -1139,19 +710,23 @@
           <w:sz w:val="24"/>
           <w:szCs w:val="24"/>
         </w:rPr>
-        <w:t xml:space="preserve">7.0 Equipment Qualification Status</w:t>
-      </w:r>
-    </w:p>
-    <w:p>
-      <w:r>
-        <w:t>{@cvp_qualification_statusXml}</w:t>
+        <w:t xml:space="preserve">SURFACE AREA OF THE EQUIPMENT</w:t>
+      </w:r>
+    </w:p>
+    <w:p>
+      <w:r>
+        <w:t>{@cvp_surface_areaXml}</w:t>
       </w:r>
     </w:p>
     <w:p>
       <w:pPr>
         <w:pStyle w:val="Heading1"/>
         <w:keepNext/>
-        <w:spacing w:before="200" w:after="80" w:line="360" w:lineRule="auto"/>
+        <w:numPr>
+          <w:ilvl w:val="0"/>
+          <w:numId w:val="3"/>
+        </w:numPr>
+        <w:spacing w:before="23" w:line="360" w:lineRule="auto"/>
         <w:jc w:val="both"/>
       </w:pPr>
       <w:r>
@@ -1160,19 +735,23 @@
           <w:sz w:val="24"/>
           <w:szCs w:val="24"/>
         </w:rPr>
-        <w:t xml:space="preserve">8.0 Surface Area of the Equipment</w:t>
-      </w:r>
-    </w:p>
-    <w:p>
-      <w:r>
-        <w:t>{@cvp_surface_areaXml}</w:t>
+        <w:t xml:space="preserve">RINSE VOLUME CALCULATION</w:t>
+      </w:r>
+    </w:p>
+    <w:p>
+      <w:r>
+        <w:t>{@cvp_rinse_volumeXml}</w:t>
       </w:r>
     </w:p>
     <w:p>
       <w:pPr>
         <w:pStyle w:val="Heading1"/>
         <w:keepNext/>
-        <w:spacing w:before="200" w:after="80" w:line="360" w:lineRule="auto"/>
+        <w:numPr>
+          <w:ilvl w:val="0"/>
+          <w:numId w:val="3"/>
+        </w:numPr>
+        <w:spacing w:before="23" w:line="360" w:lineRule="auto"/>
         <w:jc w:val="both"/>
       </w:pPr>
       <w:r>
@@ -1181,19 +760,23 @@
           <w:sz w:val="24"/>
           <w:szCs w:val="24"/>
         </w:rPr>
-        <w:t xml:space="preserve">9.0 Rinse Volume Calculation</w:t>
-      </w:r>
-    </w:p>
-    <w:p>
-      <w:r>
-        <w:t>{@cvp_rinse_volumeXml}</w:t>
+        <w:t xml:space="preserve">MAXIMUM ALLOWABLE CARRYOVER (MACO)</w:t>
+      </w:r>
+    </w:p>
+    <w:p>
+      <w:r>
+        <w:t>{@cvp_macoXml}</w:t>
       </w:r>
     </w:p>
     <w:p>
       <w:pPr>
         <w:pStyle w:val="Heading1"/>
         <w:keepNext/>
-        <w:spacing w:before="200" w:after="80" w:line="360" w:lineRule="auto"/>
+        <w:numPr>
+          <w:ilvl w:val="0"/>
+          <w:numId w:val="3"/>
+        </w:numPr>
+        <w:spacing w:before="23" w:line="360" w:lineRule="auto"/>
         <w:jc w:val="both"/>
       </w:pPr>
       <w:r>
@@ -1202,19 +785,23 @@
           <w:sz w:val="24"/>
           <w:szCs w:val="24"/>
         </w:rPr>
-        <w:t xml:space="preserve">10.0 Maximum Allowable Carryover (MACO)</w:t>
-      </w:r>
-    </w:p>
-    <w:p>
-      <w:r>
-        <w:t>{@cvp_macoXml}</w:t>
+        <w:t xml:space="preserve">ACCEPTANCE LIMIT CALCULATION (SWAB AND RINSE)</w:t>
+      </w:r>
+    </w:p>
+    <w:p>
+      <w:r>
+        <w:t>{@cvp_acceptance_limitsXml}</w:t>
       </w:r>
     </w:p>
     <w:p>
       <w:pPr>
         <w:pStyle w:val="Heading1"/>
         <w:keepNext/>
-        <w:spacing w:before="200" w:after="80" w:line="360" w:lineRule="auto"/>
+        <w:numPr>
+          <w:ilvl w:val="0"/>
+          <w:numId w:val="3"/>
+        </w:numPr>
+        <w:spacing w:before="23" w:line="360" w:lineRule="auto"/>
         <w:jc w:val="both"/>
       </w:pPr>
       <w:r>
@@ -1223,19 +810,23 @@
           <w:sz w:val="24"/>
           <w:szCs w:val="24"/>
         </w:rPr>
-        <w:t xml:space="preserve">11.0 Acceptance Limit Calculation (Swab and Rinse)</w:t>
-      </w:r>
-    </w:p>
-    <w:p>
-      <w:r>
-        <w:t>{@cvp_acceptance_limitsXml}</w:t>
+        <w:t xml:space="preserve">CLEANING VERIFICATION METHODOLOGY</w:t>
+      </w:r>
+    </w:p>
+    <w:p>
+      <w:r>
+        <w:t>{@cvp_methodologyXml}</w:t>
       </w:r>
     </w:p>
     <w:p>
       <w:pPr>
         <w:pStyle w:val="Heading1"/>
         <w:keepNext/>
-        <w:spacing w:before="200" w:after="80" w:line="360" w:lineRule="auto"/>
+        <w:numPr>
+          <w:ilvl w:val="0"/>
+          <w:numId w:val="3"/>
+        </w:numPr>
+        <w:spacing w:before="23" w:line="360" w:lineRule="auto"/>
         <w:jc w:val="both"/>
       </w:pPr>
       <w:r>
@@ -1244,19 +835,23 @@
           <w:sz w:val="24"/>
           <w:szCs w:val="24"/>
         </w:rPr>
-        <w:t xml:space="preserve">12.0 Cleaning Verification Methodology</w:t>
-      </w:r>
-    </w:p>
-    <w:p>
-      <w:r>
-        <w:t>{@cvp_methodologyXml}</w:t>
+        <w:t xml:space="preserve">SAMPLING PROCEDURE</w:t>
+      </w:r>
+    </w:p>
+    <w:p>
+      <w:r>
+        <w:t>{@cvp_sampling_procedureXml}</w:t>
       </w:r>
     </w:p>
     <w:p>
       <w:pPr>
         <w:pStyle w:val="Heading1"/>
         <w:keepNext/>
-        <w:spacing w:before="200" w:after="80" w:line="360" w:lineRule="auto"/>
+        <w:numPr>
+          <w:ilvl w:val="0"/>
+          <w:numId w:val="3"/>
+        </w:numPr>
+        <w:spacing w:before="23" w:line="360" w:lineRule="auto"/>
         <w:jc w:val="both"/>
       </w:pPr>
       <w:r>
@@ -1265,19 +860,23 @@
           <w:sz w:val="24"/>
           <w:szCs w:val="24"/>
         </w:rPr>
-        <w:t xml:space="preserve">13.0 Sampling Procedure</w:t>
-      </w:r>
-    </w:p>
-    <w:p>
-      <w:r>
-        <w:t>{@cvp_sampling_procedureXml}</w:t>
+        <w:t xml:space="preserve">DETERMINATION OF SWAB SAMPLE LOCATIONS</w:t>
+      </w:r>
+    </w:p>
+    <w:p>
+      <w:r>
+        <w:t>{@cvp_swab_locationsXml}</w:t>
       </w:r>
     </w:p>
     <w:p>
       <w:pPr>
         <w:pStyle w:val="Heading1"/>
         <w:keepNext/>
-        <w:spacing w:before="200" w:after="80" w:line="360" w:lineRule="auto"/>
+        <w:numPr>
+          <w:ilvl w:val="0"/>
+          <w:numId w:val="3"/>
+        </w:numPr>
+        <w:spacing w:before="23" w:line="360" w:lineRule="auto"/>
         <w:jc w:val="both"/>
       </w:pPr>
       <w:r>
@@ -1286,19 +885,28 @@
           <w:sz w:val="24"/>
           <w:szCs w:val="24"/>
         </w:rPr>
-        <w:t xml:space="preserve">14.0 Determination of Swab Sample Locations</w:t>
-      </w:r>
-    </w:p>
-    <w:p>
-      <w:r>
-        <w:t>{@cvp_swab_locationsXml}</w:t>
+        <w:t xml:space="preserve">SAMPLING PLAN, ACCEPTANCE CRITERIA AND CLEANING VALIDATION RESULTS SUMMARY</w:t>
+      </w:r>
+    </w:p>
+    <w:p>
+      <w:r>
+        <w:t>{@cvp_sampling_planXml}</w:t>
+      </w:r>
+    </w:p>
+    <w:p>
+      <w:r>
+        <w:t>{@cvp_equipment_samplingXml}</w:t>
       </w:r>
     </w:p>
     <w:p>
       <w:pPr>
         <w:pStyle w:val="Heading1"/>
         <w:keepNext/>
-        <w:spacing w:before="200" w:after="80" w:line="360" w:lineRule="auto"/>
+        <w:numPr>
+          <w:ilvl w:val="1"/>
+          <w:numId w:val="3"/>
+        </w:numPr>
+        <w:spacing w:before="23" w:line="360" w:lineRule="auto"/>
         <w:jc w:val="both"/>
       </w:pPr>
       <w:r>
@@ -1307,24 +915,23 @@
           <w:sz w:val="24"/>
           <w:szCs w:val="24"/>
         </w:rPr>
-        <w:t xml:space="preserve">15.0 Sampling Plan, Acceptance Criteria and Cleaning Validation Results Summary</w:t>
-      </w:r>
-    </w:p>
-    <w:p>
-      <w:r>
-        <w:t>{@cvp_sampling_planXml}</w:t>
-      </w:r>
-    </w:p>
-    <w:p>
-      <w:r>
-        <w:t>{@cvp_equipment_samplingXml}</w:t>
+        <w:t xml:space="preserve">NITROSAMINE LIMITS IN THE RINSE SAMPLES</w:t>
+      </w:r>
+    </w:p>
+    <w:p>
+      <w:r>
+        <w:t>{@cvp_nitrosamineXml}</w:t>
       </w:r>
     </w:p>
     <w:p>
       <w:pPr>
         <w:pStyle w:val="Heading1"/>
         <w:keepNext/>
-        <w:spacing w:before="200" w:after="80" w:line="360" w:lineRule="auto"/>
+        <w:numPr>
+          <w:ilvl w:val="1"/>
+          <w:numId w:val="3"/>
+        </w:numPr>
+        <w:spacing w:before="23" w:line="360" w:lineRule="auto"/>
         <w:jc w:val="both"/>
       </w:pPr>
       <w:r>
@@ -1333,19 +940,23 @@
           <w:sz w:val="24"/>
           <w:szCs w:val="24"/>
         </w:rPr>
-        <w:t xml:space="preserve">Nitrosamine Limits in the Rinse Samples</w:t>
-      </w:r>
-    </w:p>
-    <w:p>
-      <w:r>
-        <w:t>{@cvp_nitrosamineXml}</w:t>
+        <w:t xml:space="preserve">POTENTIAL GENOTOXIC IMPURITIES LIMITS IN THE RINSE SAMPLES</w:t>
+      </w:r>
+    </w:p>
+    <w:p>
+      <w:r>
+        <w:t>{@cvp_pgiXml}</w:t>
       </w:r>
     </w:p>
     <w:p>
       <w:pPr>
         <w:pStyle w:val="Heading1"/>
         <w:keepNext/>
-        <w:spacing w:before="200" w:after="80" w:line="360" w:lineRule="auto"/>
+        <w:numPr>
+          <w:ilvl w:val="1"/>
+          <w:numId w:val="3"/>
+        </w:numPr>
+        <w:spacing w:before="23" w:line="360" w:lineRule="auto"/>
         <w:jc w:val="both"/>
       </w:pPr>
       <w:r>
@@ -1354,19 +965,23 @@
           <w:sz w:val="24"/>
           <w:szCs w:val="24"/>
         </w:rPr>
-        <w:t xml:space="preserve">Potential Genotoxic Impurities Limits in the Rinse Samples</w:t>
-      </w:r>
-    </w:p>
-    <w:p>
-      <w:r>
-        <w:t>{@cvp_pgiXml}</w:t>
+        <w:t xml:space="preserve">PROCESS LINE CLEANING VERIFICATION SUMMARY</w:t>
+      </w:r>
+    </w:p>
+    <w:p>
+      <w:r>
+        <w:t>{@cvp_process_lineXml}</w:t>
       </w:r>
     </w:p>
     <w:p>
       <w:pPr>
         <w:pStyle w:val="Heading1"/>
         <w:keepNext/>
-        <w:spacing w:before="200" w:after="80" w:line="360" w:lineRule="auto"/>
+        <w:numPr>
+          <w:ilvl w:val="1"/>
+          <w:numId w:val="3"/>
+        </w:numPr>
+        <w:spacing w:before="23" w:line="360" w:lineRule="auto"/>
         <w:jc w:val="both"/>
       </w:pPr>
       <w:r>
@@ -1375,19 +990,23 @@
           <w:sz w:val="24"/>
           <w:szCs w:val="24"/>
         </w:rPr>
-        <w:t xml:space="preserve">Process Line Cleaning Verification Summary</w:t>
-      </w:r>
-    </w:p>
-    <w:p>
-      <w:r>
-        <w:t>{@cvp_process_lineXml}</w:t>
+        <w:t xml:space="preserve">MANUFACTURING AREA CLEANING VERIFICATION</w:t>
+      </w:r>
+    </w:p>
+    <w:p>
+      <w:r>
+        <w:t>{@cvp_manufacturing_areaXml}</w:t>
       </w:r>
     </w:p>
     <w:p>
       <w:pPr>
         <w:pStyle w:val="Heading1"/>
         <w:keepNext/>
-        <w:spacing w:before="200" w:after="80" w:line="360" w:lineRule="auto"/>
+        <w:numPr>
+          <w:ilvl w:val="1"/>
+          <w:numId w:val="3"/>
+        </w:numPr>
+        <w:spacing w:before="23" w:line="360" w:lineRule="auto"/>
         <w:jc w:val="both"/>
       </w:pPr>
       <w:r>
@@ -1396,19 +1015,23 @@
           <w:sz w:val="24"/>
           <w:szCs w:val="24"/>
         </w:rPr>
-        <w:t xml:space="preserve">Manufacturing Area Cleaning Verification</w:t>
-      </w:r>
-    </w:p>
-    <w:p>
-      <w:r>
-        <w:t>{@cvp_manufacturing_areaXml}</w:t>
+        <w:t xml:space="preserve">OVERALL CLEANING RESULTS SUMMARY</w:t>
+      </w:r>
+    </w:p>
+    <w:p>
+      <w:r>
+        <w:t>{@cvp_overall_resultsXml}</w:t>
       </w:r>
     </w:p>
     <w:p>
       <w:pPr>
         <w:pStyle w:val="Heading1"/>
         <w:keepNext/>
-        <w:spacing w:before="200" w:after="80" w:line="360" w:lineRule="auto"/>
+        <w:numPr>
+          <w:ilvl w:val="0"/>
+          <w:numId w:val="3"/>
+        </w:numPr>
+        <w:spacing w:before="23" w:line="360" w:lineRule="auto"/>
         <w:jc w:val="both"/>
       </w:pPr>
       <w:r>
@@ -1417,19 +1040,23 @@
           <w:sz w:val="24"/>
           <w:szCs w:val="24"/>
         </w:rPr>
-        <w:t xml:space="preserve">Overall Cleaning Results Summary</w:t>
-      </w:r>
-    </w:p>
-    <w:p>
-      <w:r>
-        <w:t>{@cvp_overall_resultsXml}</w:t>
+        <w:t xml:space="preserve">TESTING PROCEDURE</w:t>
+      </w:r>
+    </w:p>
+    <w:p>
+      <w:r>
+        <w:t>{@cvp_testing_procedureXml}</w:t>
       </w:r>
     </w:p>
     <w:p>
       <w:pPr>
         <w:pStyle w:val="Heading1"/>
         <w:keepNext/>
-        <w:spacing w:before="200" w:after="80" w:line="360" w:lineRule="auto"/>
+        <w:numPr>
+          <w:ilvl w:val="0"/>
+          <w:numId w:val="3"/>
+        </w:numPr>
+        <w:spacing w:before="23" w:line="360" w:lineRule="auto"/>
         <w:jc w:val="both"/>
       </w:pPr>
       <w:r>
@@ -1438,19 +1065,23 @@
           <w:sz w:val="24"/>
           <w:szCs w:val="24"/>
         </w:rPr>
-        <w:t xml:space="preserve">16.0 Testing Procedure</w:t>
-      </w:r>
-    </w:p>
-    <w:p>
-      <w:r>
-        <w:t>{@cvp_testing_procedureXml}</w:t>
+        <w:t xml:space="preserve">STATUS OF CLEANING ANALYTICAL METHOD VALIDATION</w:t>
+      </w:r>
+    </w:p>
+    <w:p>
+      <w:r>
+        <w:t>{@cvp_method_validationXml}</w:t>
       </w:r>
     </w:p>
     <w:p>
       <w:pPr>
         <w:pStyle w:val="Heading1"/>
         <w:keepNext/>
-        <w:spacing w:before="200" w:after="80" w:line="360" w:lineRule="auto"/>
+        <w:numPr>
+          <w:ilvl w:val="0"/>
+          <w:numId w:val="3"/>
+        </w:numPr>
+        <w:spacing w:before="23" w:line="360" w:lineRule="auto"/>
         <w:jc w:val="both"/>
       </w:pPr>
       <w:r>
@@ -1459,19 +1090,23 @@
           <w:sz w:val="24"/>
           <w:szCs w:val="24"/>
         </w:rPr>
-        <w:t xml:space="preserve">17.0 Status of Cleaning Analytical Method Validation</w:t>
-      </w:r>
-    </w:p>
-    <w:p>
-      <w:r>
-        <w:t>{@cvp_method_validationXml}</w:t>
+        <w:t xml:space="preserve">EVALUATION OF RESULTS AND REPORTING</w:t>
+      </w:r>
+    </w:p>
+    <w:p>
+      <w:r>
+        <w:t>{@cvp_evaluationXml}</w:t>
       </w:r>
     </w:p>
     <w:p>
       <w:pPr>
         <w:pStyle w:val="Heading1"/>
         <w:keepNext/>
-        <w:spacing w:before="200" w:after="80" w:line="360" w:lineRule="auto"/>
+        <w:numPr>
+          <w:ilvl w:val="0"/>
+          <w:numId w:val="3"/>
+        </w:numPr>
+        <w:spacing w:before="23" w:line="360" w:lineRule="auto"/>
         <w:jc w:val="both"/>
       </w:pPr>
       <w:r>
@@ -1480,19 +1115,23 @@
           <w:sz w:val="24"/>
           <w:szCs w:val="24"/>
         </w:rPr>
-        <w:t xml:space="preserve">18.0 Evaluation of Results and Reporting</w:t>
-      </w:r>
-    </w:p>
-    <w:p>
-      <w:r>
-        <w:t>{@cvp_evaluationXml}</w:t>
+        <w:t xml:space="preserve">DEVIATIONS</w:t>
+      </w:r>
+    </w:p>
+    <w:p>
+      <w:r>
+        <w:t>{@cvp_deviationsXml}</w:t>
       </w:r>
     </w:p>
     <w:p>
       <w:pPr>
         <w:pStyle w:val="Heading1"/>
         <w:keepNext/>
-        <w:spacing w:before="200" w:after="80" w:line="360" w:lineRule="auto"/>
+        <w:numPr>
+          <w:ilvl w:val="0"/>
+          <w:numId w:val="3"/>
+        </w:numPr>
+        <w:spacing w:before="23" w:line="360" w:lineRule="auto"/>
         <w:jc w:val="both"/>
       </w:pPr>
       <w:r>
@@ -1501,19 +1140,23 @@
           <w:sz w:val="24"/>
           <w:szCs w:val="24"/>
         </w:rPr>
-        <w:t xml:space="preserve">19.0 Deviations</w:t>
-      </w:r>
-    </w:p>
-    <w:p>
-      <w:r>
-        <w:t>{@cvp_deviationsXml}</w:t>
+        <w:t xml:space="preserve">REVALIDATION</w:t>
+      </w:r>
+    </w:p>
+    <w:p>
+      <w:r>
+        <w:t>{@cvp_revalidationXml}</w:t>
       </w:r>
     </w:p>
     <w:p>
       <w:pPr>
         <w:pStyle w:val="Heading1"/>
         <w:keepNext/>
-        <w:spacing w:before="200" w:after="80" w:line="360" w:lineRule="auto"/>
+        <w:numPr>
+          <w:ilvl w:val="0"/>
+          <w:numId w:val="3"/>
+        </w:numPr>
+        <w:spacing w:before="23" w:line="360" w:lineRule="auto"/>
         <w:jc w:val="both"/>
       </w:pPr>
       <w:r>
@@ -1522,19 +1165,23 @@
           <w:sz w:val="24"/>
           <w:szCs w:val="24"/>
         </w:rPr>
-        <w:t xml:space="preserve">20.0 Revalidation</w:t>
-      </w:r>
-    </w:p>
-    <w:p>
-      <w:r>
-        <w:t>{@cvp_revalidationXml}</w:t>
+        <w:t xml:space="preserve">ABBREVIATIONS</w:t>
+      </w:r>
+    </w:p>
+    <w:p>
+      <w:r>
+        <w:t>{@cvp_abbreviationsXml}</w:t>
       </w:r>
     </w:p>
     <w:p>
       <w:pPr>
         <w:pStyle w:val="Heading1"/>
         <w:keepNext/>
-        <w:spacing w:before="200" w:after="80" w:line="360" w:lineRule="auto"/>
+        <w:numPr>
+          <w:ilvl w:val="0"/>
+          <w:numId w:val="3"/>
+        </w:numPr>
+        <w:spacing w:before="23" w:line="360" w:lineRule="auto"/>
         <w:jc w:val="both"/>
       </w:pPr>
       <w:r>
@@ -1543,19 +1190,23 @@
           <w:sz w:val="24"/>
           <w:szCs w:val="24"/>
         </w:rPr>
-        <w:t xml:space="preserve">21.0 Abbreviations</w:t>
-      </w:r>
-    </w:p>
-    <w:p>
-      <w:r>
-        <w:t>{@cvp_abbreviationsXml}</w:t>
+        <w:t xml:space="preserve">RELATED DOCUMENTS</w:t>
+      </w:r>
+    </w:p>
+    <w:p>
+      <w:r>
+        <w:t>{@cvp_related_documentsXml}</w:t>
       </w:r>
     </w:p>
     <w:p>
       <w:pPr>
         <w:pStyle w:val="Heading1"/>
         <w:keepNext/>
-        <w:spacing w:before="200" w:after="80" w:line="360" w:lineRule="auto"/>
+        <w:numPr>
+          <w:ilvl w:val="0"/>
+          <w:numId w:val="3"/>
+        </w:numPr>
+        <w:spacing w:before="23" w:line="360" w:lineRule="auto"/>
         <w:jc w:val="both"/>
       </w:pPr>
       <w:r>
@@ -1564,19 +1215,23 @@
           <w:sz w:val="24"/>
           <w:szCs w:val="24"/>
         </w:rPr>
-        <w:t xml:space="preserve">22.0 Related Documents</w:t>
-      </w:r>
-    </w:p>
-    <w:p>
-      <w:r>
-        <w:t>{@cvp_related_documentsXml}</w:t>
+        <w:t xml:space="preserve">LIST OF ANNEXURES</w:t>
+      </w:r>
+    </w:p>
+    <w:p>
+      <w:r>
+        <w:t>{@cvp_annexuresXml}</w:t>
       </w:r>
     </w:p>
     <w:p>
       <w:pPr>
         <w:pStyle w:val="Heading1"/>
         <w:keepNext/>
-        <w:spacing w:before="200" w:after="80" w:line="360" w:lineRule="auto"/>
+        <w:numPr>
+          <w:ilvl w:val="0"/>
+          <w:numId w:val="3"/>
+        </w:numPr>
+        <w:spacing w:before="23" w:line="360" w:lineRule="auto"/>
         <w:jc w:val="both"/>
       </w:pPr>
       <w:r>
@@ -1585,28 +1240,7 @@
           <w:sz w:val="24"/>
           <w:szCs w:val="24"/>
         </w:rPr>
-        <w:t xml:space="preserve">23.0 List of Annexures</w:t>
-      </w:r>
-    </w:p>
-    <w:p>
-      <w:r>
-        <w:t>{@cvp_annexuresXml}</w:t>
-      </w:r>
-    </w:p>
-    <w:p>
-      <w:pPr>
-        <w:pStyle w:val="Heading1"/>
-        <w:keepNext/>
-        <w:spacing w:before="200" w:after="80" w:line="360" w:lineRule="auto"/>
-        <w:jc w:val="both"/>
-      </w:pPr>
-      <w:r>
-        <w:rPr>
-          <w:b/>
-          <w:sz w:val="24"/>
-          <w:szCs w:val="24"/>
-        </w:rPr>
-        <w:t xml:space="preserve">24.0 History of the Document</w:t>
+        <w:t xml:space="preserve">HISTORY OF THE DOCUMENT</w:t>
       </w:r>
     </w:p>
     <w:p>

</xml_diff>

<commit_message>
Align cleaning-protocol Word export with the source paper form. (#477)
Replace the static TOC and baked 1.0 headings with Word numbering, and
fix spacing, list styles, merged cells, and leftover citation digits.
</commit_message>
<xml_diff>
--- a/templates/3xper-cleaning-verification-protocol-template.docx
+++ b/templates/3xper-cleaning-verification-protocol-template.docx
@@ -469,11 +469,64 @@
         <w:br w:type="page"/>
       </w:r>
     </w:p>
+    <w:sdt>
+      <w:sdtPr>
+        <w:docPartObj>
+          <w:docPartGallery w:val="Table of Contents"/>
+          <w:docPartUnique/>
+        </w:docPartObj>
+      </w:sdtPr>
+      <w:sdtContent>
+        <w:p>
+          <w:pPr>
+            <w:pStyle w:val="TOCHeading"/>
+            <w:outlineLvl w:val="9"/>
+            <w:ind w:left="0" w:firstLine="0"/>
+            <w:spacing w:before="23" w:line="360" w:lineRule="auto"/>
+          </w:pPr>
+          <w:r>
+            <w:rPr>
+              <w:b/>
+              <w:color w:val="000000"/>
+              <w:sz w:val="24"/>
+              <w:szCs w:val="24"/>
+            </w:rPr>
+            <w:t xml:space="preserve">TABLE OF CONTENTS</w:t>
+          </w:r>
+        </w:p>
+        <w:p>
+          <w:r>
+            <w:fldChar w:fldCharType="begin"/>
+          </w:r>
+          <w:r>
+            <w:instrText xml:space="preserve"> TOC \o "1-1" \h \z \u </w:instrText>
+          </w:r>
+          <w:r>
+            <w:fldChar w:fldCharType="separate"/>
+          </w:r>
+          <w:r>
+            <w:t xml:space="preserve">Right-click and choose Update Field to refresh this table of contents.</w:t>
+          </w:r>
+          <w:r>
+            <w:fldChar w:fldCharType="end"/>
+          </w:r>
+        </w:p>
+      </w:sdtContent>
+    </w:sdt>
+    <w:p>
+      <w:r>
+        <w:br w:type="page"/>
+      </w:r>
+    </w:p>
     <w:p>
       <w:pPr>
         <w:pStyle w:val="Heading1"/>
         <w:keepNext/>
-        <w:spacing w:before="200" w:after="80" w:line="360" w:lineRule="auto"/>
+        <w:numPr>
+          <w:ilvl w:val="0"/>
+          <w:numId w:val="3"/>
+        </w:numPr>
+        <w:spacing w:before="23" w:line="360" w:lineRule="auto"/>
         <w:jc w:val="both"/>
       </w:pPr>
       <w:r>
@@ -482,529 +535,23 @@
           <w:sz w:val="24"/>
           <w:szCs w:val="24"/>
         </w:rPr>
-        <w:t xml:space="preserve">TABLE OF CONTENTS</w:t>
-      </w:r>
-    </w:p>
-    <w:tbl>
-      <w:tblPr>
-        <w:tblW w:w="10000" w:type="dxa"/>
-        <w:tblBorders>
-          <w:top w:val="nil"/>
-          <w:left w:val="nil"/>
-          <w:bottom w:val="nil"/>
-          <w:right w:val="nil"/>
-          <w:insideH w:val="nil"/>
-          <w:insideV w:val="nil"/>
-        </w:tblBorders>
-      </w:tblPr>
-      <w:tblGrid>
-        <w:gridCol w:w="10000"/>
-      </w:tblGrid>
-      <w:tr>
-        <w:tc>
-          <w:tcPr>
-            <w:tcW w:w="10000" w:type="dxa"/>
-          </w:tcPr>
-          <w:p>
-            <w:pPr>
-              <w:spacing w:before="40" w:after="40"/>
-            </w:pPr>
-            <w:r>
-              <w:rPr>
-                <w:sz w:val="24"/>
-                <w:szCs w:val="24"/>
-              </w:rPr>
-              <w:t xml:space="preserve">1.0 Approval Signatures</w:t>
-            </w:r>
-          </w:p>
-        </w:tc>
-      </w:tr>
-      <w:tr>
-        <w:tc>
-          <w:tcPr>
-            <w:tcW w:w="10000" w:type="dxa"/>
-          </w:tcPr>
-          <w:p>
-            <w:pPr>
-              <w:spacing w:before="40" w:after="40"/>
-            </w:pPr>
-            <w:r>
-              <w:rPr>
-                <w:sz w:val="24"/>
-                <w:szCs w:val="24"/>
-              </w:rPr>
-              <w:t xml:space="preserve">2.0 Objective</w:t>
-            </w:r>
-          </w:p>
-        </w:tc>
-      </w:tr>
-      <w:tr>
-        <w:tc>
-          <w:tcPr>
-            <w:tcW w:w="10000" w:type="dxa"/>
-          </w:tcPr>
-          <w:p>
-            <w:pPr>
-              <w:spacing w:before="40" w:after="40"/>
-            </w:pPr>
-            <w:r>
-              <w:rPr>
-                <w:sz w:val="24"/>
-                <w:szCs w:val="24"/>
-              </w:rPr>
-              <w:t xml:space="preserve">3.0 Scope</w:t>
-            </w:r>
-          </w:p>
-        </w:tc>
-      </w:tr>
-      <w:tr>
-        <w:tc>
-          <w:tcPr>
-            <w:tcW w:w="10000" w:type="dxa"/>
-          </w:tcPr>
-          <w:p>
-            <w:pPr>
-              <w:spacing w:before="40" w:after="40"/>
-            </w:pPr>
-            <w:r>
-              <w:rPr>
-                <w:sz w:val="24"/>
-                <w:szCs w:val="24"/>
-              </w:rPr>
-              <w:t xml:space="preserve">4.0 Responsibilities</w:t>
-            </w:r>
-          </w:p>
-        </w:tc>
-      </w:tr>
-      <w:tr>
-        <w:tc>
-          <w:tcPr>
-            <w:tcW w:w="10000" w:type="dxa"/>
-          </w:tcPr>
-          <w:p>
-            <w:pPr>
-              <w:spacing w:before="40" w:after="40"/>
-            </w:pPr>
-            <w:r>
-              <w:rPr>
-                <w:sz w:val="24"/>
-                <w:szCs w:val="24"/>
-              </w:rPr>
-              <w:t xml:space="preserve">5.0 Background and Cleaning Procedure</w:t>
-            </w:r>
-          </w:p>
-        </w:tc>
-      </w:tr>
-      <w:tr>
-        <w:tc>
-          <w:tcPr>
-            <w:tcW w:w="10000" w:type="dxa"/>
-          </w:tcPr>
-          <w:p>
-            <w:pPr>
-              <w:spacing w:before="40" w:after="40"/>
-            </w:pPr>
-            <w:r>
-              <w:rPr>
-                <w:sz w:val="24"/>
-                <w:szCs w:val="24"/>
-              </w:rPr>
-              <w:t xml:space="preserve">6.0 Pre-requisites</w:t>
-            </w:r>
-          </w:p>
-        </w:tc>
-      </w:tr>
-      <w:tr>
-        <w:tc>
-          <w:tcPr>
-            <w:tcW w:w="10000" w:type="dxa"/>
-          </w:tcPr>
-          <w:p>
-            <w:pPr>
-              <w:spacing w:before="40" w:after="40"/>
-            </w:pPr>
-            <w:r>
-              <w:rPr>
-                <w:sz w:val="24"/>
-                <w:szCs w:val="24"/>
-              </w:rPr>
-              <w:t xml:space="preserve">7.0 Equipment Qualification Status</w:t>
-            </w:r>
-          </w:p>
-        </w:tc>
-      </w:tr>
-      <w:tr>
-        <w:tc>
-          <w:tcPr>
-            <w:tcW w:w="10000" w:type="dxa"/>
-          </w:tcPr>
-          <w:p>
-            <w:pPr>
-              <w:spacing w:before="40" w:after="40"/>
-            </w:pPr>
-            <w:r>
-              <w:rPr>
-                <w:sz w:val="24"/>
-                <w:szCs w:val="24"/>
-              </w:rPr>
-              <w:t xml:space="preserve">8.0 Surface Area of the Equipment</w:t>
-            </w:r>
-          </w:p>
-        </w:tc>
-      </w:tr>
-      <w:tr>
-        <w:tc>
-          <w:tcPr>
-            <w:tcW w:w="10000" w:type="dxa"/>
-          </w:tcPr>
-          <w:p>
-            <w:pPr>
-              <w:spacing w:before="40" w:after="40"/>
-            </w:pPr>
-            <w:r>
-              <w:rPr>
-                <w:sz w:val="24"/>
-                <w:szCs w:val="24"/>
-              </w:rPr>
-              <w:t xml:space="preserve">9.0 Rinse Volume Calculation</w:t>
-            </w:r>
-          </w:p>
-        </w:tc>
-      </w:tr>
-      <w:tr>
-        <w:tc>
-          <w:tcPr>
-            <w:tcW w:w="10000" w:type="dxa"/>
-          </w:tcPr>
-          <w:p>
-            <w:pPr>
-              <w:spacing w:before="40" w:after="40"/>
-            </w:pPr>
-            <w:r>
-              <w:rPr>
-                <w:sz w:val="24"/>
-                <w:szCs w:val="24"/>
-              </w:rPr>
-              <w:t xml:space="preserve">10.0 Maximum Allowable Carryover (MACO)</w:t>
-            </w:r>
-          </w:p>
-        </w:tc>
-      </w:tr>
-      <w:tr>
-        <w:tc>
-          <w:tcPr>
-            <w:tcW w:w="10000" w:type="dxa"/>
-          </w:tcPr>
-          <w:p>
-            <w:pPr>
-              <w:spacing w:before="40" w:after="40"/>
-            </w:pPr>
-            <w:r>
-              <w:rPr>
-                <w:sz w:val="24"/>
-                <w:szCs w:val="24"/>
-              </w:rPr>
-              <w:t xml:space="preserve">11.0 Acceptance Limit Calculation (Swab and Rinse)</w:t>
-            </w:r>
-          </w:p>
-        </w:tc>
-      </w:tr>
-      <w:tr>
-        <w:tc>
-          <w:tcPr>
-            <w:tcW w:w="10000" w:type="dxa"/>
-          </w:tcPr>
-          <w:p>
-            <w:pPr>
-              <w:spacing w:before="40" w:after="40"/>
-            </w:pPr>
-            <w:r>
-              <w:rPr>
-                <w:sz w:val="24"/>
-                <w:szCs w:val="24"/>
-              </w:rPr>
-              <w:t xml:space="preserve">12.0 Cleaning Verification Methodology</w:t>
-            </w:r>
-          </w:p>
-        </w:tc>
-      </w:tr>
-      <w:tr>
-        <w:tc>
-          <w:tcPr>
-            <w:tcW w:w="10000" w:type="dxa"/>
-          </w:tcPr>
-          <w:p>
-            <w:pPr>
-              <w:spacing w:before="40" w:after="40"/>
-            </w:pPr>
-            <w:r>
-              <w:rPr>
-                <w:sz w:val="24"/>
-                <w:szCs w:val="24"/>
-              </w:rPr>
-              <w:t xml:space="preserve">13.0 Sampling Procedure</w:t>
-            </w:r>
-          </w:p>
-        </w:tc>
-      </w:tr>
-      <w:tr>
-        <w:tc>
-          <w:tcPr>
-            <w:tcW w:w="10000" w:type="dxa"/>
-          </w:tcPr>
-          <w:p>
-            <w:pPr>
-              <w:spacing w:before="40" w:after="40"/>
-            </w:pPr>
-            <w:r>
-              <w:rPr>
-                <w:sz w:val="24"/>
-                <w:szCs w:val="24"/>
-              </w:rPr>
-              <w:t xml:space="preserve">14.0 Determination of Swab Sample Locations</w:t>
-            </w:r>
-          </w:p>
-        </w:tc>
-      </w:tr>
-      <w:tr>
-        <w:tc>
-          <w:tcPr>
-            <w:tcW w:w="10000" w:type="dxa"/>
-          </w:tcPr>
-          <w:p>
-            <w:pPr>
-              <w:spacing w:before="40" w:after="40"/>
-            </w:pPr>
-            <w:r>
-              <w:rPr>
-                <w:sz w:val="24"/>
-                <w:szCs w:val="24"/>
-              </w:rPr>
-              <w:t xml:space="preserve">15.0 Sampling Plan, Acceptance Criteria and Cleaning Validation Results Summary</w:t>
-            </w:r>
-          </w:p>
-        </w:tc>
-      </w:tr>
-      <w:tr>
-        <w:tc>
-          <w:tcPr>
-            <w:tcW w:w="10000" w:type="dxa"/>
-          </w:tcPr>
-          <w:p>
-            <w:pPr>
-              <w:spacing w:before="40" w:after="40"/>
-            </w:pPr>
-            <w:r>
-              <w:rPr>
-                <w:sz w:val="24"/>
-                <w:szCs w:val="24"/>
-              </w:rPr>
-              <w:t xml:space="preserve">Nitrosamine Limits in the Rinse Samples</w:t>
-            </w:r>
-          </w:p>
-        </w:tc>
-      </w:tr>
-      <w:tr>
-        <w:tc>
-          <w:tcPr>
-            <w:tcW w:w="10000" w:type="dxa"/>
-          </w:tcPr>
-          <w:p>
-            <w:pPr>
-              <w:spacing w:before="40" w:after="40"/>
-            </w:pPr>
-            <w:r>
-              <w:rPr>
-                <w:sz w:val="24"/>
-                <w:szCs w:val="24"/>
-              </w:rPr>
-              <w:t xml:space="preserve">Potential Genotoxic Impurities Limits in the Rinse Samples</w:t>
-            </w:r>
-          </w:p>
-        </w:tc>
-      </w:tr>
-      <w:tr>
-        <w:tc>
-          <w:tcPr>
-            <w:tcW w:w="10000" w:type="dxa"/>
-          </w:tcPr>
-          <w:p>
-            <w:pPr>
-              <w:spacing w:before="40" w:after="40"/>
-            </w:pPr>
-            <w:r>
-              <w:rPr>
-                <w:sz w:val="24"/>
-                <w:szCs w:val="24"/>
-              </w:rPr>
-              <w:t xml:space="preserve">16.0 Testing Procedure</w:t>
-            </w:r>
-          </w:p>
-        </w:tc>
-      </w:tr>
-      <w:tr>
-        <w:tc>
-          <w:tcPr>
-            <w:tcW w:w="10000" w:type="dxa"/>
-          </w:tcPr>
-          <w:p>
-            <w:pPr>
-              <w:spacing w:before="40" w:after="40"/>
-            </w:pPr>
-            <w:r>
-              <w:rPr>
-                <w:sz w:val="24"/>
-                <w:szCs w:val="24"/>
-              </w:rPr>
-              <w:t xml:space="preserve">17.0 Status of Cleaning Analytical Method Validation</w:t>
-            </w:r>
-          </w:p>
-        </w:tc>
-      </w:tr>
-      <w:tr>
-        <w:tc>
-          <w:tcPr>
-            <w:tcW w:w="10000" w:type="dxa"/>
-          </w:tcPr>
-          <w:p>
-            <w:pPr>
-              <w:spacing w:before="40" w:after="40"/>
-            </w:pPr>
-            <w:r>
-              <w:rPr>
-                <w:sz w:val="24"/>
-                <w:szCs w:val="24"/>
-              </w:rPr>
-              <w:t xml:space="preserve">18.0 Evaluation of Results and Reporting</w:t>
-            </w:r>
-          </w:p>
-        </w:tc>
-      </w:tr>
-      <w:tr>
-        <w:tc>
-          <w:tcPr>
-            <w:tcW w:w="10000" w:type="dxa"/>
-          </w:tcPr>
-          <w:p>
-            <w:pPr>
-              <w:spacing w:before="40" w:after="40"/>
-            </w:pPr>
-            <w:r>
-              <w:rPr>
-                <w:sz w:val="24"/>
-                <w:szCs w:val="24"/>
-              </w:rPr>
-              <w:t xml:space="preserve">19.0 Deviations</w:t>
-            </w:r>
-          </w:p>
-        </w:tc>
-      </w:tr>
-      <w:tr>
-        <w:tc>
-          <w:tcPr>
-            <w:tcW w:w="10000" w:type="dxa"/>
-          </w:tcPr>
-          <w:p>
-            <w:pPr>
-              <w:spacing w:before="40" w:after="40"/>
-            </w:pPr>
-            <w:r>
-              <w:rPr>
-                <w:sz w:val="24"/>
-                <w:szCs w:val="24"/>
-              </w:rPr>
-              <w:t xml:space="preserve">20.0 Revalidation</w:t>
-            </w:r>
-          </w:p>
-        </w:tc>
-      </w:tr>
-      <w:tr>
-        <w:tc>
-          <w:tcPr>
-            <w:tcW w:w="10000" w:type="dxa"/>
-          </w:tcPr>
-          <w:p>
-            <w:pPr>
-              <w:spacing w:before="40" w:after="40"/>
-            </w:pPr>
-            <w:r>
-              <w:rPr>
-                <w:sz w:val="24"/>
-                <w:szCs w:val="24"/>
-              </w:rPr>
-              <w:t xml:space="preserve">21.0 Abbreviations</w:t>
-            </w:r>
-          </w:p>
-        </w:tc>
-      </w:tr>
-      <w:tr>
-        <w:tc>
-          <w:tcPr>
-            <w:tcW w:w="10000" w:type="dxa"/>
-          </w:tcPr>
-          <w:p>
-            <w:pPr>
-              <w:spacing w:before="40" w:after="40"/>
-            </w:pPr>
-            <w:r>
-              <w:rPr>
-                <w:sz w:val="24"/>
-                <w:szCs w:val="24"/>
-              </w:rPr>
-              <w:t xml:space="preserve">22.0 Related Documents</w:t>
-            </w:r>
-          </w:p>
-        </w:tc>
-      </w:tr>
-      <w:tr>
-        <w:tc>
-          <w:tcPr>
-            <w:tcW w:w="10000" w:type="dxa"/>
-          </w:tcPr>
-          <w:p>
-            <w:pPr>
-              <w:spacing w:before="40" w:after="40"/>
-            </w:pPr>
-            <w:r>
-              <w:rPr>
-                <w:sz w:val="24"/>
-                <w:szCs w:val="24"/>
-              </w:rPr>
-              <w:t xml:space="preserve">23.0 List of Annexures</w:t>
-            </w:r>
-          </w:p>
-        </w:tc>
-      </w:tr>
-      <w:tr>
-        <w:tc>
-          <w:tcPr>
-            <w:tcW w:w="10000" w:type="dxa"/>
-          </w:tcPr>
-          <w:p>
-            <w:pPr>
-              <w:spacing w:before="40" w:after="40"/>
-            </w:pPr>
-            <w:r>
-              <w:rPr>
-                <w:sz w:val="24"/>
-                <w:szCs w:val="24"/>
-              </w:rPr>
-              <w:t xml:space="preserve">24.0 History of the Document</w:t>
-            </w:r>
-          </w:p>
-        </w:tc>
-      </w:tr>
-    </w:tbl>
-    <w:p>
-      <w:r>
-        <w:br w:type="page"/>
+        <w:t xml:space="preserve">APPROVAL SIGNATURES</w:t>
+      </w:r>
+    </w:p>
+    <w:p>
+      <w:r>
+        <w:t>{@cvp_approvalsXml}</w:t>
       </w:r>
     </w:p>
     <w:p>
       <w:pPr>
         <w:pStyle w:val="Heading1"/>
         <w:keepNext/>
-        <w:spacing w:before="200" w:after="80" w:line="360" w:lineRule="auto"/>
+        <w:numPr>
+          <w:ilvl w:val="0"/>
+          <w:numId w:val="3"/>
+        </w:numPr>
+        <w:spacing w:before="23" w:line="360" w:lineRule="auto"/>
         <w:jc w:val="both"/>
       </w:pPr>
       <w:r>
@@ -1013,19 +560,23 @@
           <w:sz w:val="24"/>
           <w:szCs w:val="24"/>
         </w:rPr>
-        <w:t xml:space="preserve">1.0 Approval Signatures</w:t>
-      </w:r>
-    </w:p>
-    <w:p>
-      <w:r>
-        <w:t>{@cvp_approvalsXml}</w:t>
+        <w:t xml:space="preserve">OBJECTIVE</w:t>
+      </w:r>
+    </w:p>
+    <w:p>
+      <w:r>
+        <w:t>{@cvp_objectiveXml}</w:t>
       </w:r>
     </w:p>
     <w:p>
       <w:pPr>
         <w:pStyle w:val="Heading1"/>
         <w:keepNext/>
-        <w:spacing w:before="200" w:after="80" w:line="360" w:lineRule="auto"/>
+        <w:numPr>
+          <w:ilvl w:val="0"/>
+          <w:numId w:val="3"/>
+        </w:numPr>
+        <w:spacing w:before="23" w:line="360" w:lineRule="auto"/>
         <w:jc w:val="both"/>
       </w:pPr>
       <w:r>
@@ -1034,19 +585,23 @@
           <w:sz w:val="24"/>
           <w:szCs w:val="24"/>
         </w:rPr>
-        <w:t xml:space="preserve">2.0 Objective</w:t>
-      </w:r>
-    </w:p>
-    <w:p>
-      <w:r>
-        <w:t>{@cvp_objectiveXml}</w:t>
+        <w:t xml:space="preserve">SCOPE</w:t>
+      </w:r>
+    </w:p>
+    <w:p>
+      <w:r>
+        <w:t>{@cvp_scopeXml}</w:t>
       </w:r>
     </w:p>
     <w:p>
       <w:pPr>
         <w:pStyle w:val="Heading1"/>
         <w:keepNext/>
-        <w:spacing w:before="200" w:after="80" w:line="360" w:lineRule="auto"/>
+        <w:numPr>
+          <w:ilvl w:val="0"/>
+          <w:numId w:val="3"/>
+        </w:numPr>
+        <w:spacing w:before="23" w:line="360" w:lineRule="auto"/>
         <w:jc w:val="both"/>
       </w:pPr>
       <w:r>
@@ -1055,19 +610,23 @@
           <w:sz w:val="24"/>
           <w:szCs w:val="24"/>
         </w:rPr>
-        <w:t xml:space="preserve">3.0 Scope</w:t>
-      </w:r>
-    </w:p>
-    <w:p>
-      <w:r>
-        <w:t>{@cvp_scopeXml}</w:t>
+        <w:t xml:space="preserve">RESPONSIBILITIES</w:t>
+      </w:r>
+    </w:p>
+    <w:p>
+      <w:r>
+        <w:t>{@cvp_responsibilitiesXml}</w:t>
       </w:r>
     </w:p>
     <w:p>
       <w:pPr>
         <w:pStyle w:val="Heading1"/>
         <w:keepNext/>
-        <w:spacing w:before="200" w:after="80" w:line="360" w:lineRule="auto"/>
+        <w:numPr>
+          <w:ilvl w:val="0"/>
+          <w:numId w:val="3"/>
+        </w:numPr>
+        <w:spacing w:before="23" w:line="360" w:lineRule="auto"/>
         <w:jc w:val="both"/>
       </w:pPr>
       <w:r>
@@ -1076,19 +635,23 @@
           <w:sz w:val="24"/>
           <w:szCs w:val="24"/>
         </w:rPr>
-        <w:t xml:space="preserve">4.0 Responsibilities</w:t>
-      </w:r>
-    </w:p>
-    <w:p>
-      <w:r>
-        <w:t>{@cvp_responsibilitiesXml}</w:t>
+        <w:t xml:space="preserve">BACKGROUND AND CLEANING PROCEDURE</w:t>
+      </w:r>
+    </w:p>
+    <w:p>
+      <w:r>
+        <w:t>{@cvp_backgroundXml}</w:t>
       </w:r>
     </w:p>
     <w:p>
       <w:pPr>
         <w:pStyle w:val="Heading1"/>
         <w:keepNext/>
-        <w:spacing w:before="200" w:after="80" w:line="360" w:lineRule="auto"/>
+        <w:numPr>
+          <w:ilvl w:val="0"/>
+          <w:numId w:val="3"/>
+        </w:numPr>
+        <w:spacing w:before="23" w:line="360" w:lineRule="auto"/>
         <w:jc w:val="both"/>
       </w:pPr>
       <w:r>
@@ -1097,19 +660,23 @@
           <w:sz w:val="24"/>
           <w:szCs w:val="24"/>
         </w:rPr>
-        <w:t xml:space="preserve">5.0 Background and Cleaning Procedure</w:t>
-      </w:r>
-    </w:p>
-    <w:p>
-      <w:r>
-        <w:t>{@cvp_backgroundXml}</w:t>
+        <w:t xml:space="preserve">PRE-REQUISITES</w:t>
+      </w:r>
+    </w:p>
+    <w:p>
+      <w:r>
+        <w:t>{@cvp_prerequisitesXml}</w:t>
       </w:r>
     </w:p>
     <w:p>
       <w:pPr>
         <w:pStyle w:val="Heading1"/>
         <w:keepNext/>
-        <w:spacing w:before="200" w:after="80" w:line="360" w:lineRule="auto"/>
+        <w:numPr>
+          <w:ilvl w:val="0"/>
+          <w:numId w:val="3"/>
+        </w:numPr>
+        <w:spacing w:before="23" w:line="360" w:lineRule="auto"/>
         <w:jc w:val="both"/>
       </w:pPr>
       <w:r>
@@ -1118,19 +685,23 @@
           <w:sz w:val="24"/>
           <w:szCs w:val="24"/>
         </w:rPr>
-        <w:t xml:space="preserve">6.0 Pre-requisites</w:t>
-      </w:r>
-    </w:p>
-    <w:p>
-      <w:r>
-        <w:t>{@cvp_prerequisitesXml}</w:t>
+        <w:t xml:space="preserve">EQUIPMENT QUALIFICATION STATUS</w:t>
+      </w:r>
+    </w:p>
+    <w:p>
+      <w:r>
+        <w:t>{@cvp_qualification_statusXml}</w:t>
       </w:r>
     </w:p>
     <w:p>
       <w:pPr>
         <w:pStyle w:val="Heading1"/>
         <w:keepNext/>
-        <w:spacing w:before="200" w:after="80" w:line="360" w:lineRule="auto"/>
+        <w:numPr>
+          <w:ilvl w:val="0"/>
+          <w:numId w:val="3"/>
+        </w:numPr>
+        <w:spacing w:before="23" w:line="360" w:lineRule="auto"/>
         <w:jc w:val="both"/>
       </w:pPr>
       <w:r>
@@ -1139,19 +710,23 @@
           <w:sz w:val="24"/>
           <w:szCs w:val="24"/>
         </w:rPr>
-        <w:t xml:space="preserve">7.0 Equipment Qualification Status</w:t>
-      </w:r>
-    </w:p>
-    <w:p>
-      <w:r>
-        <w:t>{@cvp_qualification_statusXml}</w:t>
+        <w:t xml:space="preserve">SURFACE AREA OF THE EQUIPMENT</w:t>
+      </w:r>
+    </w:p>
+    <w:p>
+      <w:r>
+        <w:t>{@cvp_surface_areaXml}</w:t>
       </w:r>
     </w:p>
     <w:p>
       <w:pPr>
         <w:pStyle w:val="Heading1"/>
         <w:keepNext/>
-        <w:spacing w:before="200" w:after="80" w:line="360" w:lineRule="auto"/>
+        <w:numPr>
+          <w:ilvl w:val="0"/>
+          <w:numId w:val="3"/>
+        </w:numPr>
+        <w:spacing w:before="23" w:line="360" w:lineRule="auto"/>
         <w:jc w:val="both"/>
       </w:pPr>
       <w:r>
@@ -1160,19 +735,23 @@
           <w:sz w:val="24"/>
           <w:szCs w:val="24"/>
         </w:rPr>
-        <w:t xml:space="preserve">8.0 Surface Area of the Equipment</w:t>
-      </w:r>
-    </w:p>
-    <w:p>
-      <w:r>
-        <w:t>{@cvp_surface_areaXml}</w:t>
+        <w:t xml:space="preserve">RINSE VOLUME CALCULATION</w:t>
+      </w:r>
+    </w:p>
+    <w:p>
+      <w:r>
+        <w:t>{@cvp_rinse_volumeXml}</w:t>
       </w:r>
     </w:p>
     <w:p>
       <w:pPr>
         <w:pStyle w:val="Heading1"/>
         <w:keepNext/>
-        <w:spacing w:before="200" w:after="80" w:line="360" w:lineRule="auto"/>
+        <w:numPr>
+          <w:ilvl w:val="0"/>
+          <w:numId w:val="3"/>
+        </w:numPr>
+        <w:spacing w:before="23" w:line="360" w:lineRule="auto"/>
         <w:jc w:val="both"/>
       </w:pPr>
       <w:r>
@@ -1181,19 +760,23 @@
           <w:sz w:val="24"/>
           <w:szCs w:val="24"/>
         </w:rPr>
-        <w:t xml:space="preserve">9.0 Rinse Volume Calculation</w:t>
-      </w:r>
-    </w:p>
-    <w:p>
-      <w:r>
-        <w:t>{@cvp_rinse_volumeXml}</w:t>
+        <w:t xml:space="preserve">MAXIMUM ALLOWABLE CARRYOVER (MACO)</w:t>
+      </w:r>
+    </w:p>
+    <w:p>
+      <w:r>
+        <w:t>{@cvp_macoXml}</w:t>
       </w:r>
     </w:p>
     <w:p>
       <w:pPr>
         <w:pStyle w:val="Heading1"/>
         <w:keepNext/>
-        <w:spacing w:before="200" w:after="80" w:line="360" w:lineRule="auto"/>
+        <w:numPr>
+          <w:ilvl w:val="0"/>
+          <w:numId w:val="3"/>
+        </w:numPr>
+        <w:spacing w:before="23" w:line="360" w:lineRule="auto"/>
         <w:jc w:val="both"/>
       </w:pPr>
       <w:r>
@@ -1202,19 +785,23 @@
           <w:sz w:val="24"/>
           <w:szCs w:val="24"/>
         </w:rPr>
-        <w:t xml:space="preserve">10.0 Maximum Allowable Carryover (MACO)</w:t>
-      </w:r>
-    </w:p>
-    <w:p>
-      <w:r>
-        <w:t>{@cvp_macoXml}</w:t>
+        <w:t xml:space="preserve">ACCEPTANCE LIMIT CALCULATION (SWAB AND RINSE)</w:t>
+      </w:r>
+    </w:p>
+    <w:p>
+      <w:r>
+        <w:t>{@cvp_acceptance_limitsXml}</w:t>
       </w:r>
     </w:p>
     <w:p>
       <w:pPr>
         <w:pStyle w:val="Heading1"/>
         <w:keepNext/>
-        <w:spacing w:before="200" w:after="80" w:line="360" w:lineRule="auto"/>
+        <w:numPr>
+          <w:ilvl w:val="0"/>
+          <w:numId w:val="3"/>
+        </w:numPr>
+        <w:spacing w:before="23" w:line="360" w:lineRule="auto"/>
         <w:jc w:val="both"/>
       </w:pPr>
       <w:r>
@@ -1223,19 +810,23 @@
           <w:sz w:val="24"/>
           <w:szCs w:val="24"/>
         </w:rPr>
-        <w:t xml:space="preserve">11.0 Acceptance Limit Calculation (Swab and Rinse)</w:t>
-      </w:r>
-    </w:p>
-    <w:p>
-      <w:r>
-        <w:t>{@cvp_acceptance_limitsXml}</w:t>
+        <w:t xml:space="preserve">CLEANING VERIFICATION METHODOLOGY</w:t>
+      </w:r>
+    </w:p>
+    <w:p>
+      <w:r>
+        <w:t>{@cvp_methodologyXml}</w:t>
       </w:r>
     </w:p>
     <w:p>
       <w:pPr>
         <w:pStyle w:val="Heading1"/>
         <w:keepNext/>
-        <w:spacing w:before="200" w:after="80" w:line="360" w:lineRule="auto"/>
+        <w:numPr>
+          <w:ilvl w:val="0"/>
+          <w:numId w:val="3"/>
+        </w:numPr>
+        <w:spacing w:before="23" w:line="360" w:lineRule="auto"/>
         <w:jc w:val="both"/>
       </w:pPr>
       <w:r>
@@ -1244,19 +835,23 @@
           <w:sz w:val="24"/>
           <w:szCs w:val="24"/>
         </w:rPr>
-        <w:t xml:space="preserve">12.0 Cleaning Verification Methodology</w:t>
-      </w:r>
-    </w:p>
-    <w:p>
-      <w:r>
-        <w:t>{@cvp_methodologyXml}</w:t>
+        <w:t xml:space="preserve">SAMPLING PROCEDURE</w:t>
+      </w:r>
+    </w:p>
+    <w:p>
+      <w:r>
+        <w:t>{@cvp_sampling_procedureXml}</w:t>
       </w:r>
     </w:p>
     <w:p>
       <w:pPr>
         <w:pStyle w:val="Heading1"/>
         <w:keepNext/>
-        <w:spacing w:before="200" w:after="80" w:line="360" w:lineRule="auto"/>
+        <w:numPr>
+          <w:ilvl w:val="0"/>
+          <w:numId w:val="3"/>
+        </w:numPr>
+        <w:spacing w:before="23" w:line="360" w:lineRule="auto"/>
         <w:jc w:val="both"/>
       </w:pPr>
       <w:r>
@@ -1265,19 +860,23 @@
           <w:sz w:val="24"/>
           <w:szCs w:val="24"/>
         </w:rPr>
-        <w:t xml:space="preserve">13.0 Sampling Procedure</w:t>
-      </w:r>
-    </w:p>
-    <w:p>
-      <w:r>
-        <w:t>{@cvp_sampling_procedureXml}</w:t>
+        <w:t xml:space="preserve">DETERMINATION OF SWAB SAMPLE LOCATIONS</w:t>
+      </w:r>
+    </w:p>
+    <w:p>
+      <w:r>
+        <w:t>{@cvp_swab_locationsXml}</w:t>
       </w:r>
     </w:p>
     <w:p>
       <w:pPr>
         <w:pStyle w:val="Heading1"/>
         <w:keepNext/>
-        <w:spacing w:before="200" w:after="80" w:line="360" w:lineRule="auto"/>
+        <w:numPr>
+          <w:ilvl w:val="0"/>
+          <w:numId w:val="3"/>
+        </w:numPr>
+        <w:spacing w:before="23" w:line="360" w:lineRule="auto"/>
         <w:jc w:val="both"/>
       </w:pPr>
       <w:r>
@@ -1286,19 +885,28 @@
           <w:sz w:val="24"/>
           <w:szCs w:val="24"/>
         </w:rPr>
-        <w:t xml:space="preserve">14.0 Determination of Swab Sample Locations</w:t>
-      </w:r>
-    </w:p>
-    <w:p>
-      <w:r>
-        <w:t>{@cvp_swab_locationsXml}</w:t>
+        <w:t xml:space="preserve">SAMPLING PLAN, ACCEPTANCE CRITERIA AND CLEANING VALIDATION RESULTS SUMMARY</w:t>
+      </w:r>
+    </w:p>
+    <w:p>
+      <w:r>
+        <w:t>{@cvp_sampling_planXml}</w:t>
+      </w:r>
+    </w:p>
+    <w:p>
+      <w:r>
+        <w:t>{@cvp_equipment_samplingXml}</w:t>
       </w:r>
     </w:p>
     <w:p>
       <w:pPr>
         <w:pStyle w:val="Heading1"/>
         <w:keepNext/>
-        <w:spacing w:before="200" w:after="80" w:line="360" w:lineRule="auto"/>
+        <w:numPr>
+          <w:ilvl w:val="1"/>
+          <w:numId w:val="3"/>
+        </w:numPr>
+        <w:spacing w:before="23" w:line="360" w:lineRule="auto"/>
         <w:jc w:val="both"/>
       </w:pPr>
       <w:r>
@@ -1307,24 +915,23 @@
           <w:sz w:val="24"/>
           <w:szCs w:val="24"/>
         </w:rPr>
-        <w:t xml:space="preserve">15.0 Sampling Plan, Acceptance Criteria and Cleaning Validation Results Summary</w:t>
-      </w:r>
-    </w:p>
-    <w:p>
-      <w:r>
-        <w:t>{@cvp_sampling_planXml}</w:t>
-      </w:r>
-    </w:p>
-    <w:p>
-      <w:r>
-        <w:t>{@cvp_equipment_samplingXml}</w:t>
+        <w:t xml:space="preserve">NITROSAMINE LIMITS IN THE RINSE SAMPLES</w:t>
+      </w:r>
+    </w:p>
+    <w:p>
+      <w:r>
+        <w:t>{@cvp_nitrosamineXml}</w:t>
       </w:r>
     </w:p>
     <w:p>
       <w:pPr>
         <w:pStyle w:val="Heading1"/>
         <w:keepNext/>
-        <w:spacing w:before="200" w:after="80" w:line="360" w:lineRule="auto"/>
+        <w:numPr>
+          <w:ilvl w:val="1"/>
+          <w:numId w:val="3"/>
+        </w:numPr>
+        <w:spacing w:before="23" w:line="360" w:lineRule="auto"/>
         <w:jc w:val="both"/>
       </w:pPr>
       <w:r>
@@ -1333,19 +940,23 @@
           <w:sz w:val="24"/>
           <w:szCs w:val="24"/>
         </w:rPr>
-        <w:t xml:space="preserve">Nitrosamine Limits in the Rinse Samples</w:t>
-      </w:r>
-    </w:p>
-    <w:p>
-      <w:r>
-        <w:t>{@cvp_nitrosamineXml}</w:t>
+        <w:t xml:space="preserve">POTENTIAL GENOTOXIC IMPURITIES LIMITS IN THE RINSE SAMPLES</w:t>
+      </w:r>
+    </w:p>
+    <w:p>
+      <w:r>
+        <w:t>{@cvp_pgiXml}</w:t>
       </w:r>
     </w:p>
     <w:p>
       <w:pPr>
         <w:pStyle w:val="Heading1"/>
         <w:keepNext/>
-        <w:spacing w:before="200" w:after="80" w:line="360" w:lineRule="auto"/>
+        <w:numPr>
+          <w:ilvl w:val="1"/>
+          <w:numId w:val="3"/>
+        </w:numPr>
+        <w:spacing w:before="23" w:line="360" w:lineRule="auto"/>
         <w:jc w:val="both"/>
       </w:pPr>
       <w:r>
@@ -1354,19 +965,23 @@
           <w:sz w:val="24"/>
           <w:szCs w:val="24"/>
         </w:rPr>
-        <w:t xml:space="preserve">Potential Genotoxic Impurities Limits in the Rinse Samples</w:t>
-      </w:r>
-    </w:p>
-    <w:p>
-      <w:r>
-        <w:t>{@cvp_pgiXml}</w:t>
+        <w:t xml:space="preserve">PROCESS LINE CLEANING VERIFICATION SUMMARY</w:t>
+      </w:r>
+    </w:p>
+    <w:p>
+      <w:r>
+        <w:t>{@cvp_process_lineXml}</w:t>
       </w:r>
     </w:p>
     <w:p>
       <w:pPr>
         <w:pStyle w:val="Heading1"/>
         <w:keepNext/>
-        <w:spacing w:before="200" w:after="80" w:line="360" w:lineRule="auto"/>
+        <w:numPr>
+          <w:ilvl w:val="1"/>
+          <w:numId w:val="3"/>
+        </w:numPr>
+        <w:spacing w:before="23" w:line="360" w:lineRule="auto"/>
         <w:jc w:val="both"/>
       </w:pPr>
       <w:r>
@@ -1375,19 +990,23 @@
           <w:sz w:val="24"/>
           <w:szCs w:val="24"/>
         </w:rPr>
-        <w:t xml:space="preserve">Process Line Cleaning Verification Summary</w:t>
-      </w:r>
-    </w:p>
-    <w:p>
-      <w:r>
-        <w:t>{@cvp_process_lineXml}</w:t>
+        <w:t xml:space="preserve">MANUFACTURING AREA CLEANING VERIFICATION</w:t>
+      </w:r>
+    </w:p>
+    <w:p>
+      <w:r>
+        <w:t>{@cvp_manufacturing_areaXml}</w:t>
       </w:r>
     </w:p>
     <w:p>
       <w:pPr>
         <w:pStyle w:val="Heading1"/>
         <w:keepNext/>
-        <w:spacing w:before="200" w:after="80" w:line="360" w:lineRule="auto"/>
+        <w:numPr>
+          <w:ilvl w:val="1"/>
+          <w:numId w:val="3"/>
+        </w:numPr>
+        <w:spacing w:before="23" w:line="360" w:lineRule="auto"/>
         <w:jc w:val="both"/>
       </w:pPr>
       <w:r>
@@ -1396,19 +1015,23 @@
           <w:sz w:val="24"/>
           <w:szCs w:val="24"/>
         </w:rPr>
-        <w:t xml:space="preserve">Manufacturing Area Cleaning Verification</w:t>
-      </w:r>
-    </w:p>
-    <w:p>
-      <w:r>
-        <w:t>{@cvp_manufacturing_areaXml}</w:t>
+        <w:t xml:space="preserve">OVERALL CLEANING RESULTS SUMMARY</w:t>
+      </w:r>
+    </w:p>
+    <w:p>
+      <w:r>
+        <w:t>{@cvp_overall_resultsXml}</w:t>
       </w:r>
     </w:p>
     <w:p>
       <w:pPr>
         <w:pStyle w:val="Heading1"/>
         <w:keepNext/>
-        <w:spacing w:before="200" w:after="80" w:line="360" w:lineRule="auto"/>
+        <w:numPr>
+          <w:ilvl w:val="0"/>
+          <w:numId w:val="3"/>
+        </w:numPr>
+        <w:spacing w:before="23" w:line="360" w:lineRule="auto"/>
         <w:jc w:val="both"/>
       </w:pPr>
       <w:r>
@@ -1417,19 +1040,23 @@
           <w:sz w:val="24"/>
           <w:szCs w:val="24"/>
         </w:rPr>
-        <w:t xml:space="preserve">Overall Cleaning Results Summary</w:t>
-      </w:r>
-    </w:p>
-    <w:p>
-      <w:r>
-        <w:t>{@cvp_overall_resultsXml}</w:t>
+        <w:t xml:space="preserve">TESTING PROCEDURE</w:t>
+      </w:r>
+    </w:p>
+    <w:p>
+      <w:r>
+        <w:t>{@cvp_testing_procedureXml}</w:t>
       </w:r>
     </w:p>
     <w:p>
       <w:pPr>
         <w:pStyle w:val="Heading1"/>
         <w:keepNext/>
-        <w:spacing w:before="200" w:after="80" w:line="360" w:lineRule="auto"/>
+        <w:numPr>
+          <w:ilvl w:val="0"/>
+          <w:numId w:val="3"/>
+        </w:numPr>
+        <w:spacing w:before="23" w:line="360" w:lineRule="auto"/>
         <w:jc w:val="both"/>
       </w:pPr>
       <w:r>
@@ -1438,19 +1065,23 @@
           <w:sz w:val="24"/>
           <w:szCs w:val="24"/>
         </w:rPr>
-        <w:t xml:space="preserve">16.0 Testing Procedure</w:t>
-      </w:r>
-    </w:p>
-    <w:p>
-      <w:r>
-        <w:t>{@cvp_testing_procedureXml}</w:t>
+        <w:t xml:space="preserve">STATUS OF CLEANING ANALYTICAL METHOD VALIDATION</w:t>
+      </w:r>
+    </w:p>
+    <w:p>
+      <w:r>
+        <w:t>{@cvp_method_validationXml}</w:t>
       </w:r>
     </w:p>
     <w:p>
       <w:pPr>
         <w:pStyle w:val="Heading1"/>
         <w:keepNext/>
-        <w:spacing w:before="200" w:after="80" w:line="360" w:lineRule="auto"/>
+        <w:numPr>
+          <w:ilvl w:val="0"/>
+          <w:numId w:val="3"/>
+        </w:numPr>
+        <w:spacing w:before="23" w:line="360" w:lineRule="auto"/>
         <w:jc w:val="both"/>
       </w:pPr>
       <w:r>
@@ -1459,19 +1090,23 @@
           <w:sz w:val="24"/>
           <w:szCs w:val="24"/>
         </w:rPr>
-        <w:t xml:space="preserve">17.0 Status of Cleaning Analytical Method Validation</w:t>
-      </w:r>
-    </w:p>
-    <w:p>
-      <w:r>
-        <w:t>{@cvp_method_validationXml}</w:t>
+        <w:t xml:space="preserve">EVALUATION OF RESULTS AND REPORTING</w:t>
+      </w:r>
+    </w:p>
+    <w:p>
+      <w:r>
+        <w:t>{@cvp_evaluationXml}</w:t>
       </w:r>
     </w:p>
     <w:p>
       <w:pPr>
         <w:pStyle w:val="Heading1"/>
         <w:keepNext/>
-        <w:spacing w:before="200" w:after="80" w:line="360" w:lineRule="auto"/>
+        <w:numPr>
+          <w:ilvl w:val="0"/>
+          <w:numId w:val="3"/>
+        </w:numPr>
+        <w:spacing w:before="23" w:line="360" w:lineRule="auto"/>
         <w:jc w:val="both"/>
       </w:pPr>
       <w:r>
@@ -1480,19 +1115,23 @@
           <w:sz w:val="24"/>
           <w:szCs w:val="24"/>
         </w:rPr>
-        <w:t xml:space="preserve">18.0 Evaluation of Results and Reporting</w:t>
-      </w:r>
-    </w:p>
-    <w:p>
-      <w:r>
-        <w:t>{@cvp_evaluationXml}</w:t>
+        <w:t xml:space="preserve">DEVIATIONS</w:t>
+      </w:r>
+    </w:p>
+    <w:p>
+      <w:r>
+        <w:t>{@cvp_deviationsXml}</w:t>
       </w:r>
     </w:p>
     <w:p>
       <w:pPr>
         <w:pStyle w:val="Heading1"/>
         <w:keepNext/>
-        <w:spacing w:before="200" w:after="80" w:line="360" w:lineRule="auto"/>
+        <w:numPr>
+          <w:ilvl w:val="0"/>
+          <w:numId w:val="3"/>
+        </w:numPr>
+        <w:spacing w:before="23" w:line="360" w:lineRule="auto"/>
         <w:jc w:val="both"/>
       </w:pPr>
       <w:r>
@@ -1501,19 +1140,23 @@
           <w:sz w:val="24"/>
           <w:szCs w:val="24"/>
         </w:rPr>
-        <w:t xml:space="preserve">19.0 Deviations</w:t>
-      </w:r>
-    </w:p>
-    <w:p>
-      <w:r>
-        <w:t>{@cvp_deviationsXml}</w:t>
+        <w:t xml:space="preserve">REVALIDATION</w:t>
+      </w:r>
+    </w:p>
+    <w:p>
+      <w:r>
+        <w:t>{@cvp_revalidationXml}</w:t>
       </w:r>
     </w:p>
     <w:p>
       <w:pPr>
         <w:pStyle w:val="Heading1"/>
         <w:keepNext/>
-        <w:spacing w:before="200" w:after="80" w:line="360" w:lineRule="auto"/>
+        <w:numPr>
+          <w:ilvl w:val="0"/>
+          <w:numId w:val="3"/>
+        </w:numPr>
+        <w:spacing w:before="23" w:line="360" w:lineRule="auto"/>
         <w:jc w:val="both"/>
       </w:pPr>
       <w:r>
@@ -1522,19 +1165,23 @@
           <w:sz w:val="24"/>
           <w:szCs w:val="24"/>
         </w:rPr>
-        <w:t xml:space="preserve">20.0 Revalidation</w:t>
-      </w:r>
-    </w:p>
-    <w:p>
-      <w:r>
-        <w:t>{@cvp_revalidationXml}</w:t>
+        <w:t xml:space="preserve">ABBREVIATIONS</w:t>
+      </w:r>
+    </w:p>
+    <w:p>
+      <w:r>
+        <w:t>{@cvp_abbreviationsXml}</w:t>
       </w:r>
     </w:p>
     <w:p>
       <w:pPr>
         <w:pStyle w:val="Heading1"/>
         <w:keepNext/>
-        <w:spacing w:before="200" w:after="80" w:line="360" w:lineRule="auto"/>
+        <w:numPr>
+          <w:ilvl w:val="0"/>
+          <w:numId w:val="3"/>
+        </w:numPr>
+        <w:spacing w:before="23" w:line="360" w:lineRule="auto"/>
         <w:jc w:val="both"/>
       </w:pPr>
       <w:r>
@@ -1543,19 +1190,23 @@
           <w:sz w:val="24"/>
           <w:szCs w:val="24"/>
         </w:rPr>
-        <w:t xml:space="preserve">21.0 Abbreviations</w:t>
-      </w:r>
-    </w:p>
-    <w:p>
-      <w:r>
-        <w:t>{@cvp_abbreviationsXml}</w:t>
+        <w:t xml:space="preserve">RELATED DOCUMENTS</w:t>
+      </w:r>
+    </w:p>
+    <w:p>
+      <w:r>
+        <w:t>{@cvp_related_documentsXml}</w:t>
       </w:r>
     </w:p>
     <w:p>
       <w:pPr>
         <w:pStyle w:val="Heading1"/>
         <w:keepNext/>
-        <w:spacing w:before="200" w:after="80" w:line="360" w:lineRule="auto"/>
+        <w:numPr>
+          <w:ilvl w:val="0"/>
+          <w:numId w:val="3"/>
+        </w:numPr>
+        <w:spacing w:before="23" w:line="360" w:lineRule="auto"/>
         <w:jc w:val="both"/>
       </w:pPr>
       <w:r>
@@ -1564,19 +1215,23 @@
           <w:sz w:val="24"/>
           <w:szCs w:val="24"/>
         </w:rPr>
-        <w:t xml:space="preserve">22.0 Related Documents</w:t>
-      </w:r>
-    </w:p>
-    <w:p>
-      <w:r>
-        <w:t>{@cvp_related_documentsXml}</w:t>
+        <w:t xml:space="preserve">LIST OF ANNEXURES</w:t>
+      </w:r>
+    </w:p>
+    <w:p>
+      <w:r>
+        <w:t>{@cvp_annexuresXml}</w:t>
       </w:r>
     </w:p>
     <w:p>
       <w:pPr>
         <w:pStyle w:val="Heading1"/>
         <w:keepNext/>
-        <w:spacing w:before="200" w:after="80" w:line="360" w:lineRule="auto"/>
+        <w:numPr>
+          <w:ilvl w:val="0"/>
+          <w:numId w:val="3"/>
+        </w:numPr>
+        <w:spacing w:before="23" w:line="360" w:lineRule="auto"/>
         <w:jc w:val="both"/>
       </w:pPr>
       <w:r>
@@ -1585,28 +1240,7 @@
           <w:sz w:val="24"/>
           <w:szCs w:val="24"/>
         </w:rPr>
-        <w:t xml:space="preserve">23.0 List of Annexures</w:t>
-      </w:r>
-    </w:p>
-    <w:p>
-      <w:r>
-        <w:t>{@cvp_annexuresXml}</w:t>
-      </w:r>
-    </w:p>
-    <w:p>
-      <w:pPr>
-        <w:pStyle w:val="Heading1"/>
-        <w:keepNext/>
-        <w:spacing w:before="200" w:after="80" w:line="360" w:lineRule="auto"/>
-        <w:jc w:val="both"/>
-      </w:pPr>
-      <w:r>
-        <w:rPr>
-          <w:b/>
-          <w:sz w:val="24"/>
-          <w:szCs w:val="24"/>
-        </w:rPr>
-        <w:t xml:space="preserve">24.0 History of the Document</w:t>
+        <w:t xml:space="preserve">HISTORY OF THE DOCUMENT</w:t>
       </w:r>
     </w:p>
     <w:p>

</xml_diff>

<commit_message>
updating template to a validation protocol
</commit_message>
<xml_diff>
--- a/templates/3xper-cleaning-verification-protocol-template.docx
+++ b/templates/3xper-cleaning-verification-protocol-template.docx
@@ -105,7 +105,7 @@
           <w:sz w:val="32"/>
           <w:szCs w:val="32"/>
         </w:rPr>
-        <w:t xml:space="preserve"> VERIFICATION </w:t>
+        <w:t xml:space="preserve"> VALIDATION </w:t>
       </w:r>
       <w:r>
         <w:rPr>
@@ -810,7 +810,7 @@
           <w:sz w:val="24"/>
           <w:szCs w:val="24"/>
         </w:rPr>
-        <w:t xml:space="preserve">CLEANING VERIFICATION METHODOLOGY</w:t>
+        <w:t xml:space="preserve">CLEANING VALIDATION METHODOLOGY</w:t>
       </w:r>
     </w:p>
     <w:p>
@@ -965,7 +965,7 @@
           <w:sz w:val="24"/>
           <w:szCs w:val="24"/>
         </w:rPr>
-        <w:t xml:space="preserve">PROCESS LINE CLEANING VERIFICATION SUMMARY</w:t>
+        <w:t xml:space="preserve">PROCESS LINE CLEANING VALIDATION SUMMARY</w:t>
       </w:r>
     </w:p>
     <w:p>
@@ -990,7 +990,7 @@
           <w:sz w:val="24"/>
           <w:szCs w:val="24"/>
         </w:rPr>
-        <w:t xml:space="preserve">MANUFACTURING AREA CLEANING VERIFICATION</w:t>
+        <w:t xml:space="preserve">MANUFACTURING AREA CLEANING VALIDATION</w:t>
       </w:r>
     </w:p>
     <w:p>
@@ -1676,7 +1676,7 @@
               <w:sz w:val="24"/>
               <w:szCs w:val="24"/>
             </w:rPr>
-            <w:t>VERIFICATION</w:t>
+            <w:t>VALIDATION</w:t>
           </w:r>
           <w:r>
             <w:rPr>
@@ -2224,7 +2224,7 @@
               <w:sz w:val="24"/>
               <w:szCs w:val="24"/>
             </w:rPr>
-            <w:t>VERIFICATION</w:t>
+            <w:t>VALIDATION</w:t>
           </w:r>
           <w:r>
             <w:rPr>

</xml_diff>

<commit_message>
updating template to a validation protocol (#487)
* updating template to a validation protocol

* updating template to a validation protocol

* Export 8+ column Word tables on landscape pages.

Wide protocol tables wrap on portrait A4; rotate them and stretch stored widths to the landscape band so rinse and similar grids stay readable. Keep residue and extraneous seed tables as distinct empty scaffolds when they share Batch headers.

* aligning template structure

* updating template

* Seed nitrosamine and PGI rinse limits in the template.

Existing reports pick up 0.1 ppm and 0.2 ppm on the Limit NMT row when the section is merged, including cells that still said TBU.
</commit_message>
<xml_diff>
--- a/templates/3xper-cleaning-verification-protocol-template.docx
+++ b/templates/3xper-cleaning-verification-protocol-template.docx
@@ -105,7 +105,7 @@
           <w:sz w:val="32"/>
           <w:szCs w:val="32"/>
         </w:rPr>
-        <w:t xml:space="preserve"> VERIFICATION </w:t>
+        <w:t xml:space="preserve"> VALIDATION </w:t>
       </w:r>
       <w:r>
         <w:rPr>
@@ -810,7 +810,7 @@
           <w:sz w:val="24"/>
           <w:szCs w:val="24"/>
         </w:rPr>
-        <w:t xml:space="preserve">CLEANING VERIFICATION METHODOLOGY</w:t>
+        <w:t xml:space="preserve">CLEANING VALIDATION METHODOLOGY</w:t>
       </w:r>
     </w:p>
     <w:p>
@@ -965,7 +965,7 @@
           <w:sz w:val="24"/>
           <w:szCs w:val="24"/>
         </w:rPr>
-        <w:t xml:space="preserve">PROCESS LINE CLEANING VERIFICATION SUMMARY</w:t>
+        <w:t xml:space="preserve">PROCESS LINE CLEANING VALIDATION SUMMARY</w:t>
       </w:r>
     </w:p>
     <w:p>
@@ -990,7 +990,7 @@
           <w:sz w:val="24"/>
           <w:szCs w:val="24"/>
         </w:rPr>
-        <w:t xml:space="preserve">MANUFACTURING AREA CLEANING VERIFICATION</w:t>
+        <w:t xml:space="preserve">MANUFACTURING AREA CLEANING VALIDATION</w:t>
       </w:r>
     </w:p>
     <w:p>
@@ -1676,7 +1676,7 @@
               <w:sz w:val="24"/>
               <w:szCs w:val="24"/>
             </w:rPr>
-            <w:t>VERIFICATION</w:t>
+            <w:t>VALIDATION</w:t>
           </w:r>
           <w:r>
             <w:rPr>
@@ -2224,7 +2224,7 @@
               <w:sz w:val="24"/>
               <w:szCs w:val="24"/>
             </w:rPr>
-            <w:t>VERIFICATION</w:t>
+            <w:t>VALIDATION</w:t>
           </w:r>
           <w:r>
             <w:rPr>

</xml_diff>

<commit_message>
Align the CVP seed with Stage-5 structure without copying unfinished report claims.
New protocols get the 1.0–25.0 outline, typed 15.N equipment boxes, and Stage-5 limits, while on-read upgrade reshapes empty tables and leaves filled cells and leftover PGI sections alone.
</commit_message>
<xml_diff>
--- a/templates/3xper-cleaning-verification-protocol-template.docx
+++ b/templates/3xper-cleaning-verification-protocol-template.docx
@@ -940,87 +940,12 @@
           <w:sz w:val="24"/>
           <w:szCs w:val="24"/>
         </w:rPr>
-        <w:t xml:space="preserve">POTENTIAL GENOTOXIC IMPURITIES LIMITS IN THE RINSE SAMPLES</w:t>
-      </w:r>
-    </w:p>
-    <w:p>
-      <w:r>
-        <w:t>{@cvp_pgiXml}</w:t>
-      </w:r>
-    </w:p>
-    <w:p>
-      <w:pPr>
-        <w:pStyle w:val="Heading1"/>
-        <w:keepNext/>
-        <w:numPr>
-          <w:ilvl w:val="1"/>
-          <w:numId w:val="3"/>
-        </w:numPr>
-        <w:spacing w:before="23" w:line="360" w:lineRule="auto"/>
-        <w:jc w:val="both"/>
-      </w:pPr>
-      <w:r>
-        <w:rPr>
-          <w:b/>
-          <w:sz w:val="24"/>
-          <w:szCs w:val="24"/>
-        </w:rPr>
-        <w:t xml:space="preserve">PROCESS LINE CLEANING VALIDATION SUMMARY</w:t>
-      </w:r>
-    </w:p>
-    <w:p>
-      <w:r>
-        <w:t>{@cvp_process_lineXml}</w:t>
-      </w:r>
-    </w:p>
-    <w:p>
-      <w:pPr>
-        <w:pStyle w:val="Heading1"/>
-        <w:keepNext/>
-        <w:numPr>
-          <w:ilvl w:val="1"/>
-          <w:numId w:val="3"/>
-        </w:numPr>
-        <w:spacing w:before="23" w:line="360" w:lineRule="auto"/>
-        <w:jc w:val="both"/>
-      </w:pPr>
-      <w:r>
-        <w:rPr>
-          <w:b/>
-          <w:sz w:val="24"/>
-          <w:szCs w:val="24"/>
-        </w:rPr>
         <w:t xml:space="preserve">MANUFACTURING AREA CLEANING VALIDATION</w:t>
       </w:r>
     </w:p>
     <w:p>
       <w:r>
         <w:t>{@cvp_manufacturing_areaXml}</w:t>
-      </w:r>
-    </w:p>
-    <w:p>
-      <w:pPr>
-        <w:pStyle w:val="Heading1"/>
-        <w:keepNext/>
-        <w:numPr>
-          <w:ilvl w:val="1"/>
-          <w:numId w:val="3"/>
-        </w:numPr>
-        <w:spacing w:before="23" w:line="360" w:lineRule="auto"/>
-        <w:jc w:val="both"/>
-      </w:pPr>
-      <w:r>
-        <w:rPr>
-          <w:b/>
-          <w:sz w:val="24"/>
-          <w:szCs w:val="24"/>
-        </w:rPr>
-        <w:t xml:space="preserve">OVERALL CLEANING RESULTS SUMMARY</w:t>
-      </w:r>
-    </w:p>
-    <w:p>
-      <w:r>
-        <w:t>{@cvp_overall_resultsXml}</w:t>
       </w:r>
     </w:p>
     <w:p>
@@ -1146,6 +1071,56 @@
     <w:p>
       <w:r>
         <w:t>{@cvp_revalidationXml}</w:t>
+      </w:r>
+    </w:p>
+    <w:p>
+      <w:pPr>
+        <w:pStyle w:val="Heading1"/>
+        <w:keepNext/>
+        <w:numPr>
+          <w:ilvl w:val="0"/>
+          <w:numId w:val="3"/>
+        </w:numPr>
+        <w:spacing w:before="23" w:line="360" w:lineRule="auto"/>
+        <w:jc w:val="both"/>
+      </w:pPr>
+      <w:r>
+        <w:rPr>
+          <w:b/>
+          <w:sz w:val="24"/>
+          <w:szCs w:val="24"/>
+        </w:rPr>
+        <w:t xml:space="preserve">OVERALL CLEANING RESULTS SUMMARY</w:t>
+      </w:r>
+    </w:p>
+    <w:p>
+      <w:r>
+        <w:t>{@cvp_overall_resultsXml}</w:t>
+      </w:r>
+    </w:p>
+    <w:p>
+      <w:pPr>
+        <w:pStyle w:val="Heading1"/>
+        <w:keepNext/>
+        <w:numPr>
+          <w:ilvl w:val="0"/>
+          <w:numId w:val="0"/>
+        </w:numPr>
+        <w:spacing w:before="23" w:line="360" w:lineRule="auto"/>
+        <w:jc w:val="both"/>
+      </w:pPr>
+      <w:r>
+        <w:rPr>
+          <w:b/>
+          <w:sz w:val="24"/>
+          <w:szCs w:val="24"/>
+        </w:rPr>
+        <w:t xml:space="preserve">RECOMMENDATIONS</w:t>
+      </w:r>
+    </w:p>
+    <w:p>
+      <w:r>
+        <w:t>{@cvp_recommendationsXml}</w:t>
       </w:r>
     </w:p>
     <w:p>

</xml_diff>